<commit_message>
TRD-EHR paper 1: no encoder is called primary in the rest of the paper's write-ups either -- the paper folder's README, the references index, the six reserve documents and the manuscript and supplement header notes name Qwen3-Embedding-8B; review/ and the 2025-09-25 deck stay as records; reserve and packet rebuilt
</commit_message>
<xml_diff>
--- a/projects/TRD-EHR/paper1-trd-prediction/reserve/encoder_similarity_geometry.docx
+++ b/projects/TRD-EHR/paper1-trd-prediction/reserve/encoder_similarity_geometry.docx
@@ -2,7 +2,7 @@
 <file path=word/document.xml><?xml version="1.0" encoding="utf-8"?>
 <w:document xmlns:w="http://schemas.openxmlformats.org/wordprocessingml/2006/main" xmlns:m="http://schemas.openxmlformats.org/officeDocument/2006/math" xmlns:r="http://schemas.openxmlformats.org/officeDocument/2006/relationships" xmlns:o="urn:schemas-microsoft-com:office:office" xmlns:v="urn:schemas-microsoft-com:vml" xmlns:w10="urn:schemas-microsoft-com:office:word" xmlns:a="http://schemas.openxmlformats.org/drawingml/2006/main" xmlns:pic="http://schemas.openxmlformats.org/drawingml/2006/picture" xmlns:wp="http://schemas.openxmlformats.org/drawingml/2006/wordprocessingDrawing">
   <w:body>
-    <w:bookmarkStart w:id="26" w:name="X2bee812e1e14522bea4b870eb8d528821331569"/>
+    <w:bookmarkStart w:id="38" w:name="X2bee812e1e14522bea4b870eb8d528821331569"/>
     <w:p>
       <w:pPr>
         <w:pStyle w:val="Heading1"/>
@@ -79,8 +79,8 @@
       </w:pPr>
       <w:r>
         <w:rPr>
+          <w:b/>
           <w:bCs/>
-          <w:b/>
         </w:rPr>
         <w:t xml:space="preserve">(A) bge-small-en-v1.5</w:t>
       </w:r>
@@ -92,14 +92,14 @@
       <w:r>
         <w:drawing>
           <wp:inline>
-            <wp:extent cx="5486400" cy="3291840"/>
+            <wp:extent cx="5486400" cy="2962656"/>
             <wp:effectExtent b="0" l="0" r="0" t="0"/>
-            <wp:docPr descr="" title="" id="1" name="Picture"/>
+            <wp:docPr descr="" title="" id="21" name="Picture"/>
             <a:graphic>
               <a:graphicData uri="http://schemas.openxmlformats.org/drawingml/2006/picture">
                 <pic:pic>
                   <pic:nvPicPr>
-                    <pic:cNvPr descr="../results/bge-small-en-v1.5/google_medgemma-27b-text-it/cosine_score_random_vs_neighbor.png" id="0" name="Picture"/>
+                    <pic:cNvPr descr="../results/bge-small-en-v1.5/google_medgemma-27b-text-it/cosine_score_random_vs_neighbor.png" id="22" name="Picture"/>
                     <pic:cNvPicPr>
                       <a:picLocks noChangeArrowheads="1" noChangeAspect="1"/>
                     </pic:cNvPicPr>
@@ -113,7 +113,7 @@
                   <pic:spPr bwMode="auto">
                     <a:xfrm>
                       <a:off x="0" y="0"/>
-                      <a:ext cx="5486400" cy="3291840"/>
+                      <a:ext cx="5486400" cy="2962656"/>
                     </a:xfrm>
                     <a:prstGeom prst="rect">
                       <a:avLst/>
@@ -138,8 +138,8 @@
       </w:pPr>
       <w:r>
         <w:rPr>
+          <w:b/>
           <w:bCs/>
-          <w:b/>
         </w:rPr>
         <w:t xml:space="preserve">(B) bge-en-icl</w:t>
       </w:r>
@@ -151,20 +151,20 @@
       <w:r>
         <w:drawing>
           <wp:inline>
-            <wp:extent cx="5486400" cy="3291840"/>
+            <wp:extent cx="5486400" cy="2962656"/>
             <wp:effectExtent b="0" l="0" r="0" t="0"/>
-            <wp:docPr descr="" title="" id="1" name="Picture"/>
+            <wp:docPr descr="" title="" id="24" name="Picture"/>
             <a:graphic>
               <a:graphicData uri="http://schemas.openxmlformats.org/drawingml/2006/picture">
                 <pic:pic>
                   <pic:nvPicPr>
-                    <pic:cNvPr descr="../results/bge-en-icl/google_medgemma-27b-text-it/cosine_score_random_vs_neighbor.png" id="0" name="Picture"/>
+                    <pic:cNvPr descr="../results/bge-en-icl/google_medgemma-27b-text-it/cosine_score_random_vs_neighbor.png" id="25" name="Picture"/>
                     <pic:cNvPicPr>
                       <a:picLocks noChangeArrowheads="1" noChangeAspect="1"/>
                     </pic:cNvPicPr>
                   </pic:nvPicPr>
                   <pic:blipFill>
-                    <a:blip r:embed="rId21"/>
+                    <a:blip r:embed="rId23"/>
                     <a:stretch>
                       <a:fillRect/>
                     </a:stretch>
@@ -172,7 +172,7 @@
                   <pic:spPr bwMode="auto">
                     <a:xfrm>
                       <a:off x="0" y="0"/>
-                      <a:ext cx="5486400" cy="3291840"/>
+                      <a:ext cx="5486400" cy="2962656"/>
                     </a:xfrm>
                     <a:prstGeom prst="rect">
                       <a:avLst/>
@@ -197,8 +197,8 @@
       </w:pPr>
       <w:r>
         <w:rPr>
+          <w:b/>
           <w:bCs/>
-          <w:b/>
         </w:rPr>
         <w:t xml:space="preserve">(C) Qwen3-Embedding-4B</w:t>
       </w:r>
@@ -210,20 +210,20 @@
       <w:r>
         <w:drawing>
           <wp:inline>
-            <wp:extent cx="5486400" cy="3291840"/>
+            <wp:extent cx="5486400" cy="2962656"/>
             <wp:effectExtent b="0" l="0" r="0" t="0"/>
-            <wp:docPr descr="" title="" id="1" name="Picture"/>
+            <wp:docPr descr="" title="" id="27" name="Picture"/>
             <a:graphic>
               <a:graphicData uri="http://schemas.openxmlformats.org/drawingml/2006/picture">
                 <pic:pic>
                   <pic:nvPicPr>
-                    <pic:cNvPr descr="../results/Qwen-Qwen3-Embedding-4B/google_medgemma-27b-text-it/cosine_score_random_vs_neighbor.png" id="0" name="Picture"/>
+                    <pic:cNvPr descr="../results/Qwen-Qwen3-Embedding-4B/google_medgemma-27b-text-it/cosine_score_random_vs_neighbor.png" id="28" name="Picture"/>
                     <pic:cNvPicPr>
                       <a:picLocks noChangeArrowheads="1" noChangeAspect="1"/>
                     </pic:cNvPicPr>
                   </pic:nvPicPr>
                   <pic:blipFill>
-                    <a:blip r:embed="rId22"/>
+                    <a:blip r:embed="rId26"/>
                     <a:stretch>
                       <a:fillRect/>
                     </a:stretch>
@@ -231,7 +231,7 @@
                   <pic:spPr bwMode="auto">
                     <a:xfrm>
                       <a:off x="0" y="0"/>
-                      <a:ext cx="5486400" cy="3291840"/>
+                      <a:ext cx="5486400" cy="2962656"/>
                     </a:xfrm>
                     <a:prstGeom prst="rect">
                       <a:avLst/>
@@ -256,8 +256,8 @@
       </w:pPr>
       <w:r>
         <w:rPr>
+          <w:b/>
           <w:bCs/>
-          <w:b/>
         </w:rPr>
         <w:t xml:space="preserve">(D) Qwen3-Embedding-8B</w:t>
       </w:r>
@@ -269,20 +269,20 @@
       <w:r>
         <w:drawing>
           <wp:inline>
-            <wp:extent cx="5486400" cy="3291840"/>
+            <wp:extent cx="5486400" cy="2962656"/>
             <wp:effectExtent b="0" l="0" r="0" t="0"/>
-            <wp:docPr descr="" title="" id="1" name="Picture"/>
+            <wp:docPr descr="" title="" id="30" name="Picture"/>
             <a:graphic>
               <a:graphicData uri="http://schemas.openxmlformats.org/drawingml/2006/picture">
                 <pic:pic>
                   <pic:nvPicPr>
-                    <pic:cNvPr descr="../results/Qwen-Qwen3-Embedding-8B/google_medgemma-27b-text-it/cosine_score_random_vs_neighbor.png" id="0" name="Picture"/>
+                    <pic:cNvPr descr="../results/Qwen-Qwen3-Embedding-8B/google_medgemma-27b-text-it/cosine_score_random_vs_neighbor.png" id="31" name="Picture"/>
                     <pic:cNvPicPr>
                       <a:picLocks noChangeArrowheads="1" noChangeAspect="1"/>
                     </pic:cNvPicPr>
                   </pic:nvPicPr>
                   <pic:blipFill>
-                    <a:blip r:embed="rId23"/>
+                    <a:blip r:embed="rId29"/>
                     <a:stretch>
                       <a:fillRect/>
                     </a:stretch>
@@ -290,7 +290,7 @@
                   <pic:spPr bwMode="auto">
                     <a:xfrm>
                       <a:off x="0" y="0"/>
-                      <a:ext cx="5486400" cy="3291840"/>
+                      <a:ext cx="5486400" cy="2962656"/>
                     </a:xfrm>
                     <a:prstGeom prst="rect">
                       <a:avLst/>
@@ -315,150 +315,150 @@
       </w:pPr>
       <w:r>
         <w:rPr>
+          <w:b/>
           <w:bCs/>
-          <w:b/>
-          <w:iCs/>
-          <w:i/>
+          <w:i/>
+          <w:iCs/>
         </w:rPr>
         <w:t xml:space="preserve">Figure S4.</w:t>
       </w:r>
       <w:r>
         <w:rPr>
-          <w:iCs/>
-          <w:i/>
-        </w:rPr>
-        <w:t xml:space="preserve"> </w:t>
-      </w:r>
-      <w:r>
-        <w:rPr>
-          <w:iCs/>
-          <w:i/>
+          <w:i/>
+          <w:iCs/>
+        </w:rPr>
+        <w:t xml:space="preserve"> </w:t>
+      </w:r>
+      <w:r>
+        <w:rPr>
+          <w:i/>
+          <w:iCs/>
         </w:rPr>
         <w:t xml:space="preserve">Random-pair (red) versus nearest-neighbor-pair (green)</w:t>
       </w:r>
       <w:r>
         <w:rPr>
-          <w:iCs/>
-          <w:i/>
-        </w:rPr>
-        <w:t xml:space="preserve"> </w:t>
-      </w:r>
-      <w:r>
-        <w:rPr>
-          <w:iCs/>
-          <w:i/>
+          <w:i/>
+          <w:iCs/>
+        </w:rPr>
+        <w:t xml:space="preserve"> </w:t>
+      </w:r>
+      <w:r>
+        <w:rPr>
+          <w:i/>
+          <w:iCs/>
         </w:rPr>
         <w:t xml:space="preserve">cosine similarities for each encoder (full cohort). (A) bge-small-en-v1.5,</w:t>
       </w:r>
       <w:r>
         <w:rPr>
-          <w:iCs/>
-          <w:i/>
-        </w:rPr>
-        <w:t xml:space="preserve"> </w:t>
-      </w:r>
-      <w:r>
-        <w:rPr>
-          <w:iCs/>
-          <w:i/>
+          <w:i/>
+          <w:iCs/>
+        </w:rPr>
+        <w:t xml:space="preserve"> </w:t>
+      </w:r>
+      <w:r>
+        <w:rPr>
+          <w:i/>
+          <w:iCs/>
         </w:rPr>
         <w:t xml:space="preserve">(B) bge-en-icl, (C) Qwen3-Embedding-4B, (D) Qwen3-Embedding-8B. The red</w:t>
       </w:r>
       <w:r>
         <w:rPr>
-          <w:iCs/>
-          <w:i/>
-        </w:rPr>
-        <w:t xml:space="preserve"> </w:t>
-      </w:r>
-      <w:r>
-        <w:rPr>
-          <w:iCs/>
-          <w:i/>
+          <w:i/>
+          <w:iCs/>
+        </w:rPr>
+        <w:t xml:space="preserve"> </w:t>
+      </w:r>
+      <w:r>
+        <w:rPr>
+          <w:i/>
+          <w:iCs/>
         </w:rPr>
         <w:t xml:space="preserve">random-pair histogram is the encoder’s overall similarity distribution:</w:t>
       </w:r>
       <w:r>
         <w:rPr>
-          <w:iCs/>
-          <w:i/>
-        </w:rPr>
-        <w:t xml:space="preserve"> </w:t>
-      </w:r>
-      <w:r>
-        <w:rPr>
-          <w:iCs/>
-          <w:i/>
+          <w:i/>
+          <w:iCs/>
+        </w:rPr>
+        <w:t xml:space="preserve"> </w:t>
+      </w:r>
+      <w:r>
+        <w:rPr>
+          <w:i/>
+          <w:iCs/>
         </w:rPr>
         <w:t xml:space="preserve">it is multimodal only for bge-small-en-v1.5 (A) and smoothly unimodal for</w:t>
       </w:r>
       <w:r>
         <w:rPr>
-          <w:iCs/>
-          <w:i/>
-        </w:rPr>
-        <w:t xml:space="preserve"> </w:t>
-      </w:r>
-      <w:r>
-        <w:rPr>
-          <w:iCs/>
-          <w:i/>
+          <w:i/>
+          <w:iCs/>
+        </w:rPr>
+        <w:t xml:space="preserve"> </w:t>
+      </w:r>
+      <w:r>
+        <w:rPr>
+          <w:i/>
+          <w:iCs/>
         </w:rPr>
         <w:t xml:space="preserve">the other three. In every panel the neighbor-pair similarities (green)</w:t>
       </w:r>
       <w:r>
         <w:rPr>
-          <w:iCs/>
-          <w:i/>
-        </w:rPr>
-        <w:t xml:space="preserve"> </w:t>
-      </w:r>
-      <w:r>
-        <w:rPr>
-          <w:iCs/>
-          <w:i/>
+          <w:i/>
+          <w:iCs/>
+        </w:rPr>
+        <w:t xml:space="preserve"> </w:t>
+      </w:r>
+      <w:r>
+        <w:rPr>
+          <w:i/>
+          <w:iCs/>
         </w:rPr>
         <w:t xml:space="preserve">sit above the bulk of the random-pair mass, confirming that</w:t>
       </w:r>
       <w:r>
         <w:rPr>
-          <w:iCs/>
-          <w:i/>
-        </w:rPr>
-        <w:t xml:space="preserve"> </w:t>
-      </w:r>
-      <w:r>
-        <w:rPr>
-          <w:iCs/>
-          <w:i/>
+          <w:i/>
+          <w:iCs/>
+        </w:rPr>
+        <w:t xml:space="preserve"> </w:t>
+      </w:r>
+      <w:r>
+        <w:rPr>
+          <w:i/>
+          <w:iCs/>
         </w:rPr>
         <w:t xml:space="preserve">nearest-neighbor retrieval selects genuinely more similar patients. Axis</w:t>
       </w:r>
       <w:r>
         <w:rPr>
-          <w:iCs/>
-          <w:i/>
-        </w:rPr>
-        <w:t xml:space="preserve"> </w:t>
-      </w:r>
-      <w:r>
-        <w:rPr>
-          <w:iCs/>
-          <w:i/>
+          <w:i/>
+          <w:iCs/>
+        </w:rPr>
+        <w:t xml:space="preserve"> </w:t>
+      </w:r>
+      <w:r>
+        <w:rPr>
+          <w:i/>
+          <w:iCs/>
         </w:rPr>
         <w:t xml:space="preserve">ranges differ per panel because the encoders occupy different absolute</w:t>
       </w:r>
       <w:r>
         <w:rPr>
-          <w:iCs/>
-          <w:i/>
-        </w:rPr>
-        <w:t xml:space="preserve"> </w:t>
-      </w:r>
-      <w:r>
-        <w:rPr>
-          <w:iCs/>
-          <w:i/>
+          <w:i/>
+          <w:iCs/>
+        </w:rPr>
+        <w:t xml:space="preserve"> </w:t>
+      </w:r>
+      <w:r>
+        <w:rPr>
+          <w:i/>
+          <w:iCs/>
         </w:rPr>
         <w:t xml:space="preserve">similarity bands.</w:t>
       </w:r>
@@ -492,13 +492,7 @@
         <w:t xml:space="preserve"> </w:t>
       </w:r>
       <w:r>
-        <w:t xml:space="preserve">“</w:t>
-      </w:r>
-      <w:r>
-        <w:t xml:space="preserve">episode</w:t>
-      </w:r>
-      <w:r>
-        <w:t xml:space="preserve">”</w:t>
+        <w:t xml:space="preserve">“episode”</w:t>
       </w:r>
       <w:r>
         <w:t xml:space="preserve"> </w:t>
@@ -537,8 +531,8 @@
       </w:r>
       <w:r>
         <w:rPr>
-          <w:iCs/>
-          <w:i/>
+          <w:i/>
+          <w:iCs/>
         </w:rPr>
         <w:t xml:space="preserve">not</w:t>
       </w:r>
@@ -552,13 +546,7 @@
         <w:t xml:space="preserve"> </w:t>
       </w:r>
       <w:r>
-        <w:t xml:space="preserve">“</w:t>
-      </w:r>
-      <w:r>
-        <w:t xml:space="preserve">recurrent</w:t>
-      </w:r>
-      <w:r>
-        <w:t xml:space="preserve">”</w:t>
+        <w:t xml:space="preserve">“recurrent”</w:t>
       </w:r>
       <w:r>
         <w:t xml:space="preserve"> </w:t>
@@ -570,13 +558,7 @@
         <w:t xml:space="preserve"> </w:t>
       </w:r>
       <w:r>
-        <w:t xml:space="preserve">“</w:t>
-      </w:r>
-      <w:r>
-        <w:t xml:space="preserve">non-recurrent</w:t>
-      </w:r>
-      <w:r>
-        <w:t xml:space="preserve">”</w:t>
+        <w:t xml:space="preserve">“non-recurrent”</w:t>
       </w:r>
       <w:r>
         <w:t xml:space="preserve">. The</w:t>
@@ -624,13 +606,7 @@
         <w:t xml:space="preserve"> </w:t>
       </w:r>
       <w:r>
-        <w:t xml:space="preserve">“</w:t>
-      </w:r>
-      <w:r>
-        <w:t xml:space="preserve">episode</w:t>
-      </w:r>
-      <w:r>
-        <w:t xml:space="preserve">”</w:t>
+        <w:t xml:space="preserve">“episode”</w:t>
       </w:r>
       <w:r>
         <w:t xml:space="preserve">. So:</w:t>
@@ -638,16 +614,16 @@
     </w:p>
     <w:p>
       <w:pPr>
+        <w:pStyle w:val="Compact"/>
         <w:numPr>
           <w:ilvl w:val="0"/>
           <w:numId w:val="1001"/>
         </w:numPr>
-        <w:pStyle w:val="Compact"/>
-      </w:pPr>
-      <w:r>
-        <w:rPr>
+      </w:pPr>
+      <w:r>
+        <w:rPr>
+          <w:b/>
           <w:bCs/>
-          <w:b/>
         </w:rPr>
         <w:t xml:space="preserve">Cluster B (28,141)</w:t>
       </w:r>
@@ -661,13 +637,7 @@
         <w:t xml:space="preserve"> </w:t>
       </w:r>
       <w:r>
-        <w:t xml:space="preserve">“</w:t>
-      </w:r>
-      <w:r>
-        <w:t xml:space="preserve">episode</w:t>
-      </w:r>
-      <w:r>
-        <w:t xml:space="preserve">”</w:t>
+        <w:t xml:space="preserve">“episode”</w:t>
       </w:r>
       <w:r>
         <w:t xml:space="preserve">, which are the</w:t>
@@ -681,16 +651,16 @@
     </w:p>
     <w:p>
       <w:pPr>
+        <w:pStyle w:val="Compact"/>
         <w:numPr>
           <w:ilvl w:val="0"/>
           <w:numId w:val="1001"/>
         </w:numPr>
-        <w:pStyle w:val="Compact"/>
-      </w:pPr>
-      <w:r>
-        <w:rPr>
+      </w:pPr>
+      <w:r>
+        <w:rPr>
+          <w:b/>
           <w:bCs/>
-          <w:b/>
         </w:rPr>
         <w:t xml:space="preserve">Cluster A (14,438)</w:t>
       </w:r>
@@ -758,13 +728,7 @@
         <w:t xml:space="preserve"> </w:t>
       </w:r>
       <w:r>
-        <w:t xml:space="preserve">“</w:t>
-      </w:r>
-      <w:r>
-        <w:t xml:space="preserve">episode</w:t>
-      </w:r>
-      <w:r>
-        <w:t xml:space="preserve">”</w:t>
+        <w:t xml:space="preserve">“episode”</w:t>
       </w:r>
       <w:r>
         <w:t xml:space="preserve">.</w:t>
@@ -781,18 +745,15 @@
         <w:t xml:space="preserve"> </w:t>
       </w:r>
       <w:r>
-        <w:t xml:space="preserve">“</w:t>
-      </w:r>
-      <w:r>
-        <w:t xml:space="preserve">no</w:t>
-      </w:r>
-      <w:r>
-        <w:t xml:space="preserve"> </w:t>
-      </w:r>
-      <w:r>
-        <w:rPr>
-          <w:iCs/>
-          <w:i/>
+        <w:t xml:space="preserve">“no</w:t>
+      </w:r>
+      <w:r>
+        <w:t xml:space="preserve"> </w:t>
+      </w:r>
+      <w:r>
+        <w:rPr>
+          <w:i/>
+          <w:iCs/>
         </w:rPr>
         <w:t xml:space="preserve">episode</w:t>
       </w:r>
@@ -800,10 +761,7 @@
         <w:t xml:space="preserve"> </w:t>
       </w:r>
       <w:r>
-        <w:t xml:space="preserve">token</w:t>
-      </w:r>
-      <w:r>
-        <w:t xml:space="preserve">”</w:t>
+        <w:t xml:space="preserve">token”</w:t>
       </w:r>
       <w:r>
         <w:t xml:space="preserve">, not as</w:t>
@@ -812,13 +770,7 @@
         <w:t xml:space="preserve"> </w:t>
       </w:r>
       <w:r>
-        <w:t xml:space="preserve">“</w:t>
-      </w:r>
-      <w:r>
-        <w:t xml:space="preserve">all recurrent</w:t>
-      </w:r>
-      <w:r>
-        <w:t xml:space="preserve">”</w:t>
+        <w:t xml:space="preserve">“all recurrent”</w:t>
       </w:r>
       <w:r>
         <w:t xml:space="preserve">. Roughly one patient in five inside it is not coded</w:t>
@@ -842,178 +794,150 @@
       </w:pPr>
       <w:r>
         <w:rPr>
+          <w:b/>
           <w:bCs/>
-          <w:b/>
-          <w:iCs/>
-          <w:i/>
+          <w:i/>
+          <w:iCs/>
         </w:rPr>
         <w:t xml:space="preserve">Table S4.</w:t>
       </w:r>
       <w:r>
         <w:rPr>
-          <w:iCs/>
-          <w:i/>
-        </w:rPr>
-        <w:t xml:space="preserve"> </w:t>
-      </w:r>
-      <w:r>
-        <w:rPr>
-          <w:iCs/>
-          <w:i/>
+          <w:i/>
+          <w:iCs/>
+        </w:rPr>
+        <w:t xml:space="preserve"> </w:t>
+      </w:r>
+      <w:r>
+        <w:rPr>
+          <w:i/>
+          <w:iCs/>
         </w:rPr>
         <w:t xml:space="preserve">Surface tokens that most strongly separate the two</w:t>
       </w:r>
       <w:r>
         <w:rPr>
-          <w:iCs/>
-          <w:i/>
-        </w:rPr>
-        <w:t xml:space="preserve"> </w:t>
-      </w:r>
-      <w:r>
-        <w:rPr>
-          <w:iCs/>
-          <w:i/>
+          <w:i/>
+          <w:iCs/>
+        </w:rPr>
+        <w:t xml:space="preserve"> </w:t>
+      </w:r>
+      <w:r>
+        <w:rPr>
+          <w:i/>
+          <w:iCs/>
         </w:rPr>
         <w:t xml:space="preserve">k-means clusters of bge-small-en-v1.5 embeddings. Values are the</w:t>
       </w:r>
       <w:r>
         <w:rPr>
-          <w:iCs/>
-          <w:i/>
-        </w:rPr>
-        <w:t xml:space="preserve"> </w:t>
-      </w:r>
-      <w:r>
-        <w:rPr>
-          <w:iCs/>
-          <w:i/>
+          <w:i/>
+          <w:iCs/>
+        </w:rPr>
+        <w:t xml:space="preserve"> </w:t>
+      </w:r>
+      <w:r>
+        <w:rPr>
+          <w:i/>
+          <w:iCs/>
         </w:rPr>
         <w:t xml:space="preserve">fraction of narratives in each cluster containing the token (binary</w:t>
       </w:r>
       <w:r>
         <w:rPr>
-          <w:iCs/>
-          <w:i/>
-        </w:rPr>
-        <w:t xml:space="preserve"> </w:t>
-      </w:r>
-      <w:r>
-        <w:rPr>
-          <w:iCs/>
-          <w:i/>
+          <w:i/>
+          <w:iCs/>
+        </w:rPr>
+        <w:t xml:space="preserve"> </w:t>
+      </w:r>
+      <w:r>
+        <w:rPr>
+          <w:i/>
+          <w:iCs/>
         </w:rPr>
         <w:t xml:space="preserve">presence). Cluster A = 14,438 patients (narratives with no</w:t>
       </w:r>
       <w:r>
         <w:rPr>
-          <w:iCs/>
-          <w:i/>
-        </w:rPr>
-        <w:t xml:space="preserve"> </w:t>
-      </w:r>
-      <w:r>
-        <w:rPr>
-          <w:iCs/>
-          <w:i/>
-        </w:rPr>
-        <w:t xml:space="preserve">“</w:t>
-      </w:r>
-      <w:r>
-        <w:rPr>
-          <w:iCs/>
-          <w:i/>
-        </w:rPr>
-        <w:t xml:space="preserve">episode</w:t>
-      </w:r>
-      <w:r>
-        <w:rPr>
-          <w:iCs/>
-          <w:i/>
-        </w:rPr>
-        <w:t xml:space="preserve">”</w:t>
-      </w:r>
-      <w:r>
-        <w:rPr>
-          <w:iCs/>
-          <w:i/>
-        </w:rPr>
-        <w:t xml:space="preserve"> </w:t>
-      </w:r>
-      <w:r>
-        <w:rPr>
-          <w:iCs/>
-          <w:i/>
+          <w:i/>
+          <w:iCs/>
+        </w:rPr>
+        <w:t xml:space="preserve"> </w:t>
+      </w:r>
+      <w:r>
+        <w:rPr>
+          <w:i/>
+          <w:iCs/>
+        </w:rPr>
+        <w:t xml:space="preserve">“episode”</w:t>
+      </w:r>
+      <w:r>
+        <w:rPr>
+          <w:i/>
+          <w:iCs/>
+        </w:rPr>
+        <w:t xml:space="preserve"> </w:t>
+      </w:r>
+      <w:r>
+        <w:rPr>
+          <w:i/>
+          <w:iCs/>
         </w:rPr>
         <w:t xml:space="preserve">token: recurrent-coded plus unspecified/dysthymia), cluster B = 28,141</w:t>
       </w:r>
       <w:r>
         <w:rPr>
-          <w:iCs/>
-          <w:i/>
-        </w:rPr>
-        <w:t xml:space="preserve"> </w:t>
-      </w:r>
-      <w:r>
-        <w:rPr>
-          <w:iCs/>
-          <w:i/>
+          <w:i/>
+          <w:iCs/>
+        </w:rPr>
+        <w:t xml:space="preserve"> </w:t>
+      </w:r>
+      <w:r>
+        <w:rPr>
+          <w:i/>
+          <w:iCs/>
         </w:rPr>
         <w:t xml:space="preserve">(single-episode narratives). The token</w:t>
       </w:r>
       <w:r>
         <w:rPr>
-          <w:iCs/>
-          <w:i/>
-        </w:rPr>
-        <w:t xml:space="preserve"> </w:t>
-      </w:r>
-      <w:r>
-        <w:rPr>
-          <w:iCs/>
-          <w:i/>
-        </w:rPr>
-        <w:t xml:space="preserve">“</w:t>
-      </w:r>
-      <w:r>
-        <w:rPr>
-          <w:iCs/>
-          <w:i/>
-        </w:rPr>
-        <w:t xml:space="preserve">single</w:t>
-      </w:r>
-      <w:r>
-        <w:rPr>
-          <w:iCs/>
-          <w:i/>
-        </w:rPr>
-        <w:t xml:space="preserve">”</w:t>
-      </w:r>
-      <w:r>
-        <w:rPr>
-          <w:iCs/>
-          <w:i/>
-        </w:rPr>
-        <w:t xml:space="preserve"> </w:t>
-      </w:r>
-      <w:r>
-        <w:rPr>
-          <w:iCs/>
-          <w:i/>
+          <w:i/>
+          <w:iCs/>
+        </w:rPr>
+        <w:t xml:space="preserve"> </w:t>
+      </w:r>
+      <w:r>
+        <w:rPr>
+          <w:i/>
+          <w:iCs/>
+        </w:rPr>
+        <w:t xml:space="preserve">“single”</w:t>
+      </w:r>
+      <w:r>
+        <w:rPr>
+          <w:i/>
+          <w:iCs/>
+        </w:rPr>
+        <w:t xml:space="preserve"> </w:t>
+      </w:r>
+      <w:r>
+        <w:rPr>
+          <w:i/>
+          <w:iCs/>
         </w:rPr>
         <w:t xml:space="preserve">is elevated in both</w:t>
       </w:r>
       <w:r>
         <w:rPr>
-          <w:iCs/>
-          <w:i/>
-        </w:rPr>
-        <w:t xml:space="preserve"> </w:t>
-      </w:r>
-      <w:r>
-        <w:rPr>
-          <w:iCs/>
-          <w:i/>
+          <w:i/>
+          <w:iCs/>
+        </w:rPr>
+        <w:t xml:space="preserve"> </w:t>
+      </w:r>
+      <w:r>
+        <w:rPr>
+          <w:i/>
+          <w:iCs/>
         </w:rPr>
         <w:t xml:space="preserve">clusters because it also occurs as a marital status.</w:t>
       </w:r>
@@ -1021,16 +945,24 @@
     <w:tbl>
       <w:tblPr>
         <w:tblStyle w:val="Table"/>
-        <w:tblW w:type="pct" w:w="0.0"/>
+        <w:tblW w:type="auto" w:w="0"/>
         <w:tblLook w:firstRow="1" w:lastRow="0" w:firstColumn="0" w:lastColumn="0" w:noHBand="0" w:noVBand="0" w:val="0020"/>
       </w:tblPr>
-      <w:tblGrid/>
+      <w:tblGrid>
+        <w:gridCol w:w="1980"/>
+        <w:gridCol w:w="1980"/>
+        <w:gridCol w:w="1980"/>
+        <w:gridCol w:w="1980"/>
+      </w:tblGrid>
       <w:tr>
+        <w:trPr>
+          <w:tblHeader w:val="on"/>
+        </w:trPr>
         <w:tc>
+          <w:tcPr/>
           <w:p>
             <w:pPr>
               <w:pStyle w:val="Compact"/>
-              <w:jc w:val="left"/>
             </w:pPr>
             <w:r>
               <w:t xml:space="preserve">Token</w:t>
@@ -1038,6 +970,7 @@
           </w:p>
         </w:tc>
         <w:tc>
+          <w:tcPr/>
           <w:p>
             <w:pPr>
               <w:pStyle w:val="Compact"/>
@@ -1049,6 +982,7 @@
           </w:p>
         </w:tc>
         <w:tc>
+          <w:tcPr/>
           <w:p>
             <w:pPr>
               <w:pStyle w:val="Compact"/>
@@ -1060,6 +994,7 @@
           </w:p>
         </w:tc>
         <w:tc>
+          <w:tcPr/>
           <w:p>
             <w:pPr>
               <w:pStyle w:val="Compact"/>
@@ -1073,10 +1008,10 @@
       </w:tr>
       <w:tr>
         <w:tc>
+          <w:tcPr/>
           <w:p>
             <w:pPr>
               <w:pStyle w:val="Compact"/>
-              <w:jc w:val="left"/>
             </w:pPr>
             <w:r>
               <w:t xml:space="preserve">episode</w:t>
@@ -1084,6 +1019,7 @@
           </w:p>
         </w:tc>
         <w:tc>
+          <w:tcPr/>
           <w:p>
             <w:pPr>
               <w:pStyle w:val="Compact"/>
@@ -1095,6 +1031,7 @@
           </w:p>
         </w:tc>
         <w:tc>
+          <w:tcPr/>
           <w:p>
             <w:pPr>
               <w:pStyle w:val="Compact"/>
@@ -1106,6 +1043,7 @@
           </w:p>
         </w:tc>
         <w:tc>
+          <w:tcPr/>
           <w:p>
             <w:pPr>
               <w:pStyle w:val="Compact"/>
@@ -1119,10 +1057,10 @@
       </w:tr>
       <w:tr>
         <w:tc>
+          <w:tcPr/>
           <w:p>
             <w:pPr>
               <w:pStyle w:val="Compact"/>
-              <w:jc w:val="left"/>
             </w:pPr>
             <w:r>
               <w:t xml:space="preserve">recurrent</w:t>
@@ -1130,6 +1068,7 @@
           </w:p>
         </w:tc>
         <w:tc>
+          <w:tcPr/>
           <w:p>
             <w:pPr>
               <w:pStyle w:val="Compact"/>
@@ -1141,6 +1080,7 @@
           </w:p>
         </w:tc>
         <w:tc>
+          <w:tcPr/>
           <w:p>
             <w:pPr>
               <w:pStyle w:val="Compact"/>
@@ -1152,6 +1092,7 @@
           </w:p>
         </w:tc>
         <w:tc>
+          <w:tcPr/>
           <w:p>
             <w:pPr>
               <w:pStyle w:val="Compact"/>
@@ -1165,10 +1106,10 @@
       </w:tr>
       <w:tr>
         <w:tc>
+          <w:tcPr/>
           <w:p>
             <w:pPr>
               <w:pStyle w:val="Compact"/>
-              <w:jc w:val="left"/>
             </w:pPr>
             <w:r>
               <w:t xml:space="preserve">single</w:t>
@@ -1176,6 +1117,7 @@
           </w:p>
         </w:tc>
         <w:tc>
+          <w:tcPr/>
           <w:p>
             <w:pPr>
               <w:pStyle w:val="Compact"/>
@@ -1187,6 +1129,7 @@
           </w:p>
         </w:tc>
         <w:tc>
+          <w:tcPr/>
           <w:p>
             <w:pPr>
               <w:pStyle w:val="Compact"/>
@@ -1198,6 +1141,7 @@
           </w:p>
         </w:tc>
         <w:tc>
+          <w:tcPr/>
           <w:p>
             <w:pPr>
               <w:pStyle w:val="Compact"/>
@@ -1211,10 +1155,10 @@
       </w:tr>
       <w:tr>
         <w:tc>
+          <w:tcPr/>
           <w:p>
             <w:pPr>
               <w:pStyle w:val="Compact"/>
-              <w:jc w:val="left"/>
             </w:pPr>
             <w:r>
               <w:t xml:space="preserve">unspecified</w:t>
@@ -1222,6 +1166,7 @@
           </w:p>
         </w:tc>
         <w:tc>
+          <w:tcPr/>
           <w:p>
             <w:pPr>
               <w:pStyle w:val="Compact"/>
@@ -1233,6 +1178,7 @@
           </w:p>
         </w:tc>
         <w:tc>
+          <w:tcPr/>
           <w:p>
             <w:pPr>
               <w:pStyle w:val="Compact"/>
@@ -1244,6 +1190,7 @@
           </w:p>
         </w:tc>
         <w:tc>
+          <w:tcPr/>
           <w:p>
             <w:pPr>
               <w:pStyle w:val="Compact"/>
@@ -1257,10 +1204,10 @@
       </w:tr>
       <w:tr>
         <w:tc>
+          <w:tcPr/>
           <w:p>
             <w:pPr>
               <w:pStyle w:val="Compact"/>
-              <w:jc w:val="left"/>
             </w:pPr>
             <w:r>
               <w:t xml:space="preserve">moderate</w:t>
@@ -1268,6 +1215,7 @@
           </w:p>
         </w:tc>
         <w:tc>
+          <w:tcPr/>
           <w:p>
             <w:pPr>
               <w:pStyle w:val="Compact"/>
@@ -1279,6 +1227,7 @@
           </w:p>
         </w:tc>
         <w:tc>
+          <w:tcPr/>
           <w:p>
             <w:pPr>
               <w:pStyle w:val="Compact"/>
@@ -1290,6 +1239,7 @@
           </w:p>
         </w:tc>
         <w:tc>
+          <w:tcPr/>
           <w:p>
             <w:pPr>
               <w:pStyle w:val="Compact"/>
@@ -1314,8 +1264,8 @@
       </w:r>
       <w:r>
         <w:rPr>
-          <w:iCs/>
-          <w:i/>
+          <w:i/>
+          <w:iCs/>
         </w:rPr>
         <w:t xml:space="preserve">pairs of patients</w:t>
       </w:r>
@@ -1376,13 +1326,7 @@
         <w:t xml:space="preserve"> </w:t>
       </w:r>
       <w:r>
-        <w:t xml:space="preserve">“</w:t>
-      </w:r>
-      <w:r>
-        <w:t xml:space="preserve">episode</w:t>
-      </w:r>
-      <w:r>
-        <w:t xml:space="preserve">”</w:t>
+        <w:t xml:space="preserve">“episode”</w:t>
       </w:r>
       <w:r>
         <w:t xml:space="preserve">:</w:t>
@@ -1392,22 +1336,22 @@
       </w:r>
       <w:r>
         <w:rPr>
-          <w:iCs/>
-          <w:i/>
+          <w:i/>
+          <w:iCs/>
         </w:rPr>
         <w:t xml:space="preserve">do</w:t>
       </w:r>
       <w:r>
         <w:rPr>
-          <w:iCs/>
-          <w:i/>
-        </w:rPr>
-        <w:t xml:space="preserve"> </w:t>
-      </w:r>
-      <w:r>
-        <w:rPr>
-          <w:iCs/>
-          <w:i/>
+          <w:i/>
+          <w:iCs/>
+        </w:rPr>
+        <w:t xml:space="preserve"> </w:t>
+      </w:r>
+      <w:r>
+        <w:rPr>
+          <w:i/>
+          <w:iCs/>
         </w:rPr>
         <w:t xml:space="preserve">both narratives contain it, or does neither?</w:t>
       </w:r>
@@ -1459,13 +1403,7 @@
         <w:t xml:space="preserve"> </w:t>
       </w:r>
       <w:r>
-        <w:t xml:space="preserve">“</w:t>
-      </w:r>
-      <w:r>
-        <w:t xml:space="preserve">recurrent</w:t>
-      </w:r>
-      <w:r>
-        <w:t xml:space="preserve">”</w:t>
+        <w:t xml:space="preserve">“recurrent”</w:t>
       </w:r>
       <w:r>
         <w:t xml:space="preserve">.</w:t>
@@ -1480,13 +1418,7 @@
         <w:t xml:space="preserve"> </w:t>
       </w:r>
       <w:r>
-        <w:t xml:space="preserve">“</w:t>
-      </w:r>
-      <w:r>
-        <w:t xml:space="preserve">episode</w:t>
-      </w:r>
-      <w:r>
-        <w:t xml:space="preserve">”</w:t>
+        <w:t xml:space="preserve">“episode”</w:t>
       </w:r>
       <w:r>
         <w:t xml:space="preserve">, which makes panel A’s question uninformative there. And</w:t>
@@ -1495,13 +1427,7 @@
         <w:t xml:space="preserve"> </w:t>
       </w:r>
       <w:r>
-        <w:t xml:space="preserve">“</w:t>
-      </w:r>
-      <w:r>
-        <w:t xml:space="preserve">recurrent</w:t>
-      </w:r>
-      <w:r>
-        <w:t xml:space="preserve">”</w:t>
+        <w:t xml:space="preserve">“recurrent”</w:t>
       </w:r>
       <w:r>
         <w:t xml:space="preserve"> </w:t>
@@ -1626,50 +1552,36 @@
       </w:pPr>
       <w:r>
         <w:rPr>
+          <w:b/>
           <w:bCs/>
+        </w:rPr>
+        <w:t xml:space="preserve">(A) All 42,579 patients, split by the</w:t>
+      </w:r>
+      <w:r>
+        <w:rPr>
           <w:b/>
-        </w:rPr>
-        <w:t xml:space="preserve">(A) All 42,579 patients, split by the</w:t>
-      </w:r>
-      <w:r>
-        <w:rPr>
           <w:bCs/>
+        </w:rPr>
+        <w:t xml:space="preserve"> </w:t>
+      </w:r>
+      <w:r>
+        <w:rPr>
           <w:b/>
-        </w:rPr>
-        <w:t xml:space="preserve"> </w:t>
-      </w:r>
-      <w:r>
-        <w:rPr>
           <w:bCs/>
+        </w:rPr>
+        <w:t xml:space="preserve">“episode”</w:t>
+      </w:r>
+      <w:r>
+        <w:rPr>
           <w:b/>
-        </w:rPr>
-        <w:t xml:space="preserve">“</w:t>
-      </w:r>
-      <w:r>
-        <w:rPr>
           <w:bCs/>
+        </w:rPr>
+        <w:t xml:space="preserve"> </w:t>
+      </w:r>
+      <w:r>
+        <w:rPr>
           <w:b/>
-        </w:rPr>
-        <w:t xml:space="preserve">episode</w:t>
-      </w:r>
-      <w:r>
-        <w:rPr>
           <w:bCs/>
-          <w:b/>
-        </w:rPr>
-        <w:t xml:space="preserve">”</w:t>
-      </w:r>
-      <w:r>
-        <w:rPr>
-          <w:bCs/>
-          <w:b/>
-        </w:rPr>
-        <w:t xml:space="preserve"> </w:t>
-      </w:r>
-      <w:r>
-        <w:rPr>
-          <w:bCs/>
-          <w:b/>
         </w:rPr>
         <w:t xml:space="preserve">token</w:t>
       </w:r>
@@ -1681,20 +1593,20 @@
       <w:r>
         <w:drawing>
           <wp:inline>
-            <wp:extent cx="5029200" cy="3292352"/>
+            <wp:extent cx="5029200" cy="2699327"/>
             <wp:effectExtent b="0" l="0" r="0" t="0"/>
-            <wp:docPr descr="" title="" id="1" name="Picture"/>
+            <wp:docPr descr="" title="" id="33" name="Picture"/>
             <a:graphic>
               <a:graphicData uri="http://schemas.openxmlformats.org/drawingml/2006/picture">
                 <pic:pic>
                   <pic:nvPicPr>
-                    <pic:cNvPr descr="../notebooks/figures/bge_small_recurrence_bimodality.png" id="0" name="Picture"/>
+                    <pic:cNvPr descr="../notebooks/figures/bge_small_recurrence_bimodality.png" id="34" name="Picture"/>
                     <pic:cNvPicPr>
                       <a:picLocks noChangeArrowheads="1" noChangeAspect="1"/>
                     </pic:cNvPicPr>
                   </pic:nvPicPr>
                   <pic:blipFill>
-                    <a:blip r:embed="rId24"/>
+                    <a:blip r:embed="rId32"/>
                     <a:stretch>
                       <a:fillRect/>
                     </a:stretch>
@@ -1702,7 +1614,7 @@
                   <pic:spPr bwMode="auto">
                     <a:xfrm>
                       <a:off x="0" y="0"/>
-                      <a:ext cx="5029200" cy="3292352"/>
+                      <a:ext cx="5029200" cy="2699327"/>
                     </a:xfrm>
                     <a:prstGeom prst="rect">
                       <a:avLst/>
@@ -1727,50 +1639,36 @@
       </w:pPr>
       <w:r>
         <w:rPr>
+          <w:b/>
           <w:bCs/>
+        </w:rPr>
+        <w:t xml:space="preserve">(B) Cluster A only (n = 14,438), split by the</w:t>
+      </w:r>
+      <w:r>
+        <w:rPr>
           <w:b/>
-        </w:rPr>
-        <w:t xml:space="preserve">(B) Cluster A only (n = 14,438), split by the</w:t>
-      </w:r>
-      <w:r>
-        <w:rPr>
           <w:bCs/>
+        </w:rPr>
+        <w:t xml:space="preserve"> </w:t>
+      </w:r>
+      <w:r>
+        <w:rPr>
           <w:b/>
-        </w:rPr>
-        <w:t xml:space="preserve"> </w:t>
-      </w:r>
-      <w:r>
-        <w:rPr>
           <w:bCs/>
+        </w:rPr>
+        <w:t xml:space="preserve">“recurrent”</w:t>
+      </w:r>
+      <w:r>
+        <w:rPr>
           <w:b/>
-        </w:rPr>
-        <w:t xml:space="preserve">“</w:t>
-      </w:r>
-      <w:r>
-        <w:rPr>
           <w:bCs/>
+        </w:rPr>
+        <w:t xml:space="preserve"> </w:t>
+      </w:r>
+      <w:r>
+        <w:rPr>
           <w:b/>
-        </w:rPr>
-        <w:t xml:space="preserve">recurrent</w:t>
-      </w:r>
-      <w:r>
-        <w:rPr>
           <w:bCs/>
-          <w:b/>
-        </w:rPr>
-        <w:t xml:space="preserve">”</w:t>
-      </w:r>
-      <w:r>
-        <w:rPr>
-          <w:bCs/>
-          <w:b/>
-        </w:rPr>
-        <w:t xml:space="preserve"> </w:t>
-      </w:r>
-      <w:r>
-        <w:rPr>
-          <w:bCs/>
-          <w:b/>
         </w:rPr>
         <w:t xml:space="preserve">token</w:t>
       </w:r>
@@ -1782,20 +1680,20 @@
       <w:r>
         <w:drawing>
           <wp:inline>
-            <wp:extent cx="5029200" cy="3292352"/>
+            <wp:extent cx="5029200" cy="2699327"/>
             <wp:effectExtent b="0" l="0" r="0" t="0"/>
-            <wp:docPr descr="" title="" id="1" name="Picture"/>
+            <wp:docPr descr="" title="" id="36" name="Picture"/>
             <a:graphic>
               <a:graphicData uri="http://schemas.openxmlformats.org/drawingml/2006/picture">
                 <pic:pic>
                   <pic:nvPicPr>
-                    <pic:cNvPr descr="../notebooks/figures/bge_small_cluster0_subsplit.png" id="0" name="Picture"/>
+                    <pic:cNvPr descr="../notebooks/figures/bge_small_cluster0_subsplit.png" id="37" name="Picture"/>
                     <pic:cNvPicPr>
                       <a:picLocks noChangeArrowheads="1" noChangeAspect="1"/>
                     </pic:cNvPicPr>
                   </pic:nvPicPr>
                   <pic:blipFill>
-                    <a:blip r:embed="rId25"/>
+                    <a:blip r:embed="rId35"/>
                     <a:stretch>
                       <a:fillRect/>
                     </a:stretch>
@@ -1803,7 +1701,7 @@
                   <pic:spPr bwMode="auto">
                     <a:xfrm>
                       <a:off x="0" y="0"/>
-                      <a:ext cx="5029200" cy="3292352"/>
+                      <a:ext cx="5029200" cy="2699327"/>
                     </a:xfrm>
                     <a:prstGeom prst="rect">
                       <a:avLst/>
@@ -1828,343 +1726,301 @@
       </w:pPr>
       <w:r>
         <w:rPr>
+          <w:b/>
           <w:bCs/>
+          <w:i/>
+          <w:iCs/>
+        </w:rPr>
+        <w:t xml:space="preserve">Figure S5.</w:t>
+      </w:r>
+      <w:r>
+        <w:rPr>
+          <w:i/>
+          <w:iCs/>
+        </w:rPr>
+        <w:t xml:space="preserve"> </w:t>
+      </w:r>
+      <w:r>
+        <w:rPr>
+          <w:i/>
+          <w:iCs/>
+        </w:rPr>
+        <w:t xml:space="preserve">Pairwise cosine-similarity distributions for</w:t>
+      </w:r>
+      <w:r>
+        <w:rPr>
+          <w:i/>
+          <w:iCs/>
+        </w:rPr>
+        <w:t xml:space="preserve"> </w:t>
+      </w:r>
+      <w:r>
+        <w:rPr>
+          <w:i/>
+          <w:iCs/>
+        </w:rPr>
+        <w:t xml:space="preserve">bge-small-en-v1.5, decomposed by whether the two patients in a pair use</w:t>
+      </w:r>
+      <w:r>
+        <w:rPr>
+          <w:i/>
+          <w:iCs/>
+        </w:rPr>
+        <w:t xml:space="preserve"> </w:t>
+      </w:r>
+      <w:r>
+        <w:rPr>
+          <w:i/>
+          <w:iCs/>
+        </w:rPr>
+        <w:t xml:space="preserve">the same wording for one token (blue = same, red = different, grey = all</w:t>
+      </w:r>
+      <w:r>
+        <w:rPr>
+          <w:i/>
+          <w:iCs/>
+        </w:rPr>
+        <w:t xml:space="preserve"> </w:t>
+      </w:r>
+      <w:r>
+        <w:rPr>
+          <w:i/>
+          <w:iCs/>
+        </w:rPr>
+        <w:t xml:space="preserve">pairs in the set shown).</w:t>
+      </w:r>
+      <w:r>
+        <w:rPr>
+          <w:i/>
+          <w:iCs/>
+        </w:rPr>
+        <w:t xml:space="preserve"> </w:t>
+      </w:r>
+      <w:r>
+        <w:rPr>
           <w:b/>
-          <w:iCs/>
-          <w:i/>
-        </w:rPr>
-        <w:t xml:space="preserve">Figure S5.</w:t>
-      </w:r>
-      <w:r>
-        <w:rPr>
-          <w:iCs/>
-          <w:i/>
-        </w:rPr>
-        <w:t xml:space="preserve"> </w:t>
-      </w:r>
-      <w:r>
-        <w:rPr>
-          <w:iCs/>
-          <w:i/>
-        </w:rPr>
-        <w:t xml:space="preserve">Pairwise cosine-similarity distributions for</w:t>
-      </w:r>
-      <w:r>
-        <w:rPr>
-          <w:iCs/>
-          <w:i/>
-        </w:rPr>
-        <w:t xml:space="preserve"> </w:t>
-      </w:r>
-      <w:r>
-        <w:rPr>
-          <w:iCs/>
-          <w:i/>
-        </w:rPr>
-        <w:t xml:space="preserve">bge-small-en-v1.5, decomposed by whether the two patients in a pair use</w:t>
-      </w:r>
-      <w:r>
-        <w:rPr>
-          <w:iCs/>
-          <w:i/>
-        </w:rPr>
-        <w:t xml:space="preserve"> </w:t>
-      </w:r>
-      <w:r>
-        <w:rPr>
-          <w:iCs/>
-          <w:i/>
-        </w:rPr>
-        <w:t xml:space="preserve">the same wording for one token (blue = same, red = different, grey = all</w:t>
-      </w:r>
-      <w:r>
-        <w:rPr>
-          <w:iCs/>
-          <w:i/>
-        </w:rPr>
-        <w:t xml:space="preserve"> </w:t>
-      </w:r>
-      <w:r>
-        <w:rPr>
-          <w:iCs/>
-          <w:i/>
-        </w:rPr>
-        <w:t xml:space="preserve">pairs in the set shown).</w:t>
-      </w:r>
-      <w:r>
-        <w:rPr>
-          <w:iCs/>
-          <w:i/>
-        </w:rPr>
-        <w:t xml:space="preserve"> </w:t>
-      </w:r>
-      <w:r>
-        <w:rPr>
           <w:bCs/>
+          <w:i/>
+          <w:iCs/>
+        </w:rPr>
+        <w:t xml:space="preserve">(A)</w:t>
+      </w:r>
+      <w:r>
+        <w:rPr>
+          <w:i/>
+          <w:iCs/>
+        </w:rPr>
+        <w:t xml:space="preserve"> </w:t>
+      </w:r>
+      <w:r>
+        <w:rPr>
+          <w:i/>
+          <w:iCs/>
+        </w:rPr>
+        <w:t xml:space="preserve">All 42,579 patients, split on the</w:t>
+      </w:r>
+      <w:r>
+        <w:rPr>
+          <w:i/>
+          <w:iCs/>
+        </w:rPr>
+        <w:t xml:space="preserve"> </w:t>
+      </w:r>
+      <w:r>
+        <w:rPr>
+          <w:i/>
+          <w:iCs/>
+        </w:rPr>
+        <w:t xml:space="preserve">“episode”</w:t>
+      </w:r>
+      <w:r>
+        <w:rPr>
+          <w:i/>
+          <w:iCs/>
+        </w:rPr>
+        <w:t xml:space="preserve"> </w:t>
+      </w:r>
+      <w:r>
+        <w:rPr>
+          <w:i/>
+          <w:iCs/>
+        </w:rPr>
+        <w:t xml:space="preserve">token: same-wording pairs form the upper mode near 0.99 and</w:t>
+      </w:r>
+      <w:r>
+        <w:rPr>
+          <w:i/>
+          <w:iCs/>
+        </w:rPr>
+        <w:t xml:space="preserve"> </w:t>
+      </w:r>
+      <w:r>
+        <w:rPr>
+          <w:i/>
+          <w:iCs/>
+        </w:rPr>
+        <w:t xml:space="preserve">differing-wording pairs the lower mode near 0.97, so the bimodality in</w:t>
+      </w:r>
+      <w:r>
+        <w:rPr>
+          <w:i/>
+          <w:iCs/>
+        </w:rPr>
+        <w:t xml:space="preserve"> </w:t>
+      </w:r>
+      <w:r>
+        <w:rPr>
+          <w:i/>
+          <w:iCs/>
+        </w:rPr>
+        <w:t xml:space="preserve">Figure S4A is driven by recurrence phrasing rather than by holistic</w:t>
+      </w:r>
+      <w:r>
+        <w:rPr>
+          <w:i/>
+          <w:iCs/>
+        </w:rPr>
+        <w:t xml:space="preserve"> </w:t>
+      </w:r>
+      <w:r>
+        <w:rPr>
+          <w:i/>
+          <w:iCs/>
+        </w:rPr>
+        <w:t xml:space="preserve">clinical similarity.</w:t>
+      </w:r>
+      <w:r>
+        <w:rPr>
+          <w:i/>
+          <w:iCs/>
+        </w:rPr>
+        <w:t xml:space="preserve"> </w:t>
+      </w:r>
+      <w:r>
+        <w:rPr>
           <w:b/>
-          <w:iCs/>
-          <w:i/>
-        </w:rPr>
-        <w:t xml:space="preserve">(A)</w:t>
-      </w:r>
-      <w:r>
-        <w:rPr>
-          <w:iCs/>
-          <w:i/>
-        </w:rPr>
-        <w:t xml:space="preserve"> </w:t>
-      </w:r>
-      <w:r>
-        <w:rPr>
-          <w:iCs/>
-          <w:i/>
-        </w:rPr>
-        <w:t xml:space="preserve">All 42,579 patients, split on the</w:t>
-      </w:r>
-      <w:r>
-        <w:rPr>
-          <w:iCs/>
-          <w:i/>
-        </w:rPr>
-        <w:t xml:space="preserve"> </w:t>
-      </w:r>
-      <w:r>
-        <w:rPr>
-          <w:iCs/>
-          <w:i/>
-        </w:rPr>
-        <w:t xml:space="preserve">“</w:t>
-      </w:r>
-      <w:r>
-        <w:rPr>
-          <w:iCs/>
-          <w:i/>
-        </w:rPr>
-        <w:t xml:space="preserve">episode</w:t>
-      </w:r>
-      <w:r>
-        <w:rPr>
-          <w:iCs/>
-          <w:i/>
-        </w:rPr>
-        <w:t xml:space="preserve">”</w:t>
-      </w:r>
-      <w:r>
-        <w:rPr>
-          <w:iCs/>
-          <w:i/>
-        </w:rPr>
-        <w:t xml:space="preserve"> </w:t>
-      </w:r>
-      <w:r>
-        <w:rPr>
-          <w:iCs/>
-          <w:i/>
-        </w:rPr>
-        <w:t xml:space="preserve">token: same-wording pairs form the upper mode near 0.99 and</w:t>
-      </w:r>
-      <w:r>
-        <w:rPr>
-          <w:iCs/>
-          <w:i/>
-        </w:rPr>
-        <w:t xml:space="preserve"> </w:t>
-      </w:r>
-      <w:r>
-        <w:rPr>
-          <w:iCs/>
-          <w:i/>
-        </w:rPr>
-        <w:t xml:space="preserve">differing-wording pairs the lower mode near 0.97, so the bimodality in</w:t>
-      </w:r>
-      <w:r>
-        <w:rPr>
-          <w:iCs/>
-          <w:i/>
-        </w:rPr>
-        <w:t xml:space="preserve"> </w:t>
-      </w:r>
-      <w:r>
-        <w:rPr>
-          <w:iCs/>
-          <w:i/>
-        </w:rPr>
-        <w:t xml:space="preserve">Figure S4A is driven by recurrence phrasing rather than by holistic</w:t>
-      </w:r>
-      <w:r>
-        <w:rPr>
-          <w:iCs/>
-          <w:i/>
-        </w:rPr>
-        <w:t xml:space="preserve"> </w:t>
-      </w:r>
-      <w:r>
-        <w:rPr>
-          <w:iCs/>
-          <w:i/>
-        </w:rPr>
-        <w:t xml:space="preserve">clinical similarity.</w:t>
-      </w:r>
-      <w:r>
-        <w:rPr>
-          <w:iCs/>
-          <w:i/>
-        </w:rPr>
-        <w:t xml:space="preserve"> </w:t>
-      </w:r>
-      <w:r>
-        <w:rPr>
           <w:bCs/>
-          <w:b/>
-          <w:iCs/>
-          <w:i/>
+          <w:i/>
+          <w:iCs/>
         </w:rPr>
         <w:t xml:space="preserve">(B)</w:t>
       </w:r>
       <w:r>
         <w:rPr>
-          <w:iCs/>
-          <w:i/>
-        </w:rPr>
-        <w:t xml:space="preserve"> </w:t>
-      </w:r>
-      <w:r>
-        <w:rPr>
-          <w:iCs/>
-          <w:i/>
+          <w:i/>
+          <w:iCs/>
+        </w:rPr>
+        <w:t xml:space="preserve"> </w:t>
+      </w:r>
+      <w:r>
+        <w:rPr>
+          <w:i/>
+          <w:iCs/>
         </w:rPr>
         <w:t xml:space="preserve">Cluster A only (the 14,438 patients whose</w:t>
       </w:r>
       <w:r>
         <w:rPr>
-          <w:iCs/>
-          <w:i/>
-        </w:rPr>
-        <w:t xml:space="preserve"> </w:t>
-      </w:r>
-      <w:r>
-        <w:rPr>
-          <w:iCs/>
-          <w:i/>
+          <w:i/>
+          <w:iCs/>
+        </w:rPr>
+        <w:t xml:space="preserve"> </w:t>
+      </w:r>
+      <w:r>
+        <w:rPr>
+          <w:i/>
+          <w:iCs/>
         </w:rPr>
         <w:t xml:space="preserve">narratives lack</w:t>
       </w:r>
       <w:r>
         <w:rPr>
-          <w:iCs/>
-          <w:i/>
-        </w:rPr>
-        <w:t xml:space="preserve"> </w:t>
-      </w:r>
-      <w:r>
-        <w:rPr>
-          <w:iCs/>
-          <w:i/>
-        </w:rPr>
-        <w:t xml:space="preserve">“</w:t>
-      </w:r>
-      <w:r>
-        <w:rPr>
-          <w:iCs/>
-          <w:i/>
-        </w:rPr>
-        <w:t xml:space="preserve">episode</w:t>
-      </w:r>
-      <w:r>
-        <w:rPr>
-          <w:iCs/>
-          <w:i/>
-        </w:rPr>
-        <w:t xml:space="preserve">”</w:t>
-      </w:r>
-      <w:r>
-        <w:rPr>
-          <w:iCs/>
-          <w:i/>
+          <w:i/>
+          <w:iCs/>
+        </w:rPr>
+        <w:t xml:space="preserve"> </w:t>
+      </w:r>
+      <w:r>
+        <w:rPr>
+          <w:i/>
+          <w:iCs/>
+        </w:rPr>
+        <w:t xml:space="preserve">“episode”</w:t>
+      </w:r>
+      <w:r>
+        <w:rPr>
+          <w:i/>
+          <w:iCs/>
         </w:rPr>
         <w:t xml:space="preserve">), split on the</w:t>
       </w:r>
       <w:r>
         <w:rPr>
-          <w:iCs/>
-          <w:i/>
-        </w:rPr>
-        <w:t xml:space="preserve"> </w:t>
-      </w:r>
-      <w:r>
-        <w:rPr>
-          <w:iCs/>
-          <w:i/>
-        </w:rPr>
-        <w:t xml:space="preserve">“</w:t>
-      </w:r>
-      <w:r>
-        <w:rPr>
-          <w:iCs/>
-          <w:i/>
-        </w:rPr>
-        <w:t xml:space="preserve">recurrent</w:t>
-      </w:r>
-      <w:r>
-        <w:rPr>
-          <w:iCs/>
-          <w:i/>
-        </w:rPr>
-        <w:t xml:space="preserve">”</w:t>
-      </w:r>
-      <w:r>
-        <w:rPr>
-          <w:iCs/>
-          <w:i/>
-        </w:rPr>
-        <w:t xml:space="preserve"> </w:t>
-      </w:r>
-      <w:r>
-        <w:rPr>
-          <w:iCs/>
-          <w:i/>
+          <w:i/>
+          <w:iCs/>
+        </w:rPr>
+        <w:t xml:space="preserve"> </w:t>
+      </w:r>
+      <w:r>
+        <w:rPr>
+          <w:i/>
+          <w:iCs/>
+        </w:rPr>
+        <w:t xml:space="preserve">“recurrent”</w:t>
+      </w:r>
+      <w:r>
+        <w:rPr>
+          <w:i/>
+          <w:iCs/>
+        </w:rPr>
+        <w:t xml:space="preserve"> </w:t>
+      </w:r>
+      <w:r>
+        <w:rPr>
+          <w:i/>
+          <w:iCs/>
         </w:rPr>
         <w:t xml:space="preserve">token: the two</w:t>
       </w:r>
       <w:r>
         <w:rPr>
-          <w:iCs/>
-          <w:i/>
-        </w:rPr>
-        <w:t xml:space="preserve"> </w:t>
-      </w:r>
-      <w:r>
-        <w:rPr>
-          <w:iCs/>
-          <w:i/>
+          <w:i/>
+          <w:iCs/>
+        </w:rPr>
+        <w:t xml:space="preserve"> </w:t>
+      </w:r>
+      <w:r>
+        <w:rPr>
+          <w:i/>
+          <w:iCs/>
         </w:rPr>
         <w:t xml:space="preserve">colours again separate, so this cluster is itself genuinely divided, once more</w:t>
       </w:r>
       <w:r>
         <w:rPr>
-          <w:iCs/>
-          <w:i/>
-        </w:rPr>
-        <w:t xml:space="preserve"> </w:t>
-      </w:r>
-      <w:r>
-        <w:rPr>
-          <w:iCs/>
-          <w:i/>
+          <w:i/>
+          <w:iCs/>
+        </w:rPr>
+        <w:t xml:space="preserve"> </w:t>
+      </w:r>
+      <w:r>
+        <w:rPr>
+          <w:i/>
+          <w:iCs/>
         </w:rPr>
         <w:t xml:space="preserve">along a surface-lexical axis. Cluster B admits no comparable</w:t>
       </w:r>
       <w:r>
         <w:rPr>
-          <w:iCs/>
-          <w:i/>
-        </w:rPr>
-        <w:t xml:space="preserve"> </w:t>
-      </w:r>
-      <w:r>
-        <w:rPr>
-          <w:iCs/>
-          <w:i/>
+          <w:i/>
+          <w:iCs/>
+        </w:rPr>
+        <w:t xml:space="preserve"> </w:t>
+      </w:r>
+      <w:r>
+        <w:rPr>
+          <w:i/>
+          <w:iCs/>
         </w:rPr>
         <w:t xml:space="preserve">second split and is not plotted (Table S5).</w:t>
       </w:r>
@@ -2294,13 +2150,7 @@
         <w:t xml:space="preserve"> </w:t>
       </w:r>
       <w:r>
-        <w:t xml:space="preserve">“</w:t>
-      </w:r>
-      <w:r>
-        <w:t xml:space="preserve">episode</w:t>
-      </w:r>
-      <w:r>
-        <w:t xml:space="preserve">”</w:t>
+        <w:t xml:space="preserve">“episode”</w:t>
       </w:r>
       <w:r>
         <w:t xml:space="preserve"> </w:t>
@@ -2313,156 +2163,126 @@
       </w:r>
       <w:r>
         <w:rPr>
+          <w:b/>
           <w:bCs/>
+        </w:rPr>
+        <w:t xml:space="preserve">more</w:t>
+      </w:r>
+      <w:r>
+        <w:t xml:space="preserve"> </w:t>
+      </w:r>
+      <w:r>
+        <w:t xml:space="preserve">cleanly than</w:t>
+      </w:r>
+      <w:r>
+        <w:t xml:space="preserve"> </w:t>
+      </w:r>
+      <w:r>
+        <w:t xml:space="preserve">the parent split itself, at a silhouette of 0.69. It splits into an explicitly</w:t>
+      </w:r>
+      <w:r>
+        <w:t xml:space="preserve"> </w:t>
+      </w:r>
+      <w:r>
+        <w:t xml:space="preserve">recurrent subgroup (n = 11,425, the token</w:t>
+      </w:r>
+      <w:r>
+        <w:t xml:space="preserve"> </w:t>
+      </w:r>
+      <w:r>
+        <w:t xml:space="preserve">“recurrent”</w:t>
+      </w:r>
+      <w:r>
+        <w:t xml:space="preserve"> </w:t>
+      </w:r>
+      <w:r>
+        <w:t xml:space="preserve">present in 98% and</w:t>
+      </w:r>
+      <w:r>
+        <w:t xml:space="preserve"> </w:t>
+      </w:r>
+      <w:r>
+        <w:t xml:space="preserve">carrying the severity words</w:t>
+      </w:r>
+      <w:r>
+        <w:t xml:space="preserve"> </w:t>
+      </w:r>
+      <w:r>
+        <w:t xml:space="preserve">“moderate”</w:t>
+      </w:r>
+      <w:r>
+        <w:t xml:space="preserve">,</w:t>
+      </w:r>
+      <w:r>
+        <w:t xml:space="preserve"> </w:t>
+      </w:r>
+      <w:r>
+        <w:t xml:space="preserve">“mild”</w:t>
+      </w:r>
+      <w:r>
+        <w:t xml:space="preserve"> </w:t>
+      </w:r>
+      <w:r>
+        <w:t xml:space="preserve">and</w:t>
+      </w:r>
+      <w:r>
+        <w:t xml:space="preserve"> </w:t>
+      </w:r>
+      <w:r>
+        <w:t xml:space="preserve">“severe”</w:t>
+      </w:r>
+      <w:r>
+        <w:t xml:space="preserve">) and a smaller</w:t>
+      </w:r>
+      <w:r>
+        <w:t xml:space="preserve"> </w:t>
+      </w:r>
+      <w:r>
+        <w:t xml:space="preserve">unspecified-recurrence subgroup (n = 3,013,</w:t>
+      </w:r>
+      <w:r>
+        <w:t xml:space="preserve"> </w:t>
+      </w:r>
+      <w:r>
+        <w:t xml:space="preserve">“unspecified”</w:t>
+      </w:r>
+      <w:r>
+        <w:t xml:space="preserve"> </w:t>
+      </w:r>
+      <w:r>
+        <w:t xml:space="preserve">in 100% and no</w:t>
+      </w:r>
+      <w:r>
+        <w:t xml:space="preserve"> </w:t>
+      </w:r>
+      <w:r>
+        <w:t xml:space="preserve">severity wording). That smaller</w:t>
+      </w:r>
+      <w:r>
+        <w:t xml:space="preserve"> </w:t>
+      </w:r>
+      <w:r>
+        <w:t xml:space="preserve">subgroup is the same ≈3,000 patients (7% of the cohort) that a flat</w:t>
+      </w:r>
+      <w:r>
+        <w:t xml:space="preserve"> </w:t>
+      </w:r>
+      <w:r>
+        <w:t xml:space="preserve">three-cluster solution peels off. Cluster B (single-episode)</w:t>
+      </w:r>
+      <w:r>
+        <w:t xml:space="preserve"> </w:t>
+      </w:r>
+      <w:r>
+        <w:t xml:space="preserve">does</w:t>
+      </w:r>
+      <w:r>
+        <w:t xml:space="preserve"> </w:t>
+      </w:r>
+      <w:r>
+        <w:rPr>
           <w:b/>
-        </w:rPr>
-        <w:t xml:space="preserve">more</w:t>
-      </w:r>
-      <w:r>
-        <w:t xml:space="preserve"> </w:t>
-      </w:r>
-      <w:r>
-        <w:t xml:space="preserve">cleanly than</w:t>
-      </w:r>
-      <w:r>
-        <w:t xml:space="preserve"> </w:t>
-      </w:r>
-      <w:r>
-        <w:t xml:space="preserve">the parent split itself, at a silhouette of 0.69. It splits into an explicitly</w:t>
-      </w:r>
-      <w:r>
-        <w:t xml:space="preserve"> </w:t>
-      </w:r>
-      <w:r>
-        <w:t xml:space="preserve">recurrent subgroup (n = 11,425, the token</w:t>
-      </w:r>
-      <w:r>
-        <w:t xml:space="preserve"> </w:t>
-      </w:r>
-      <w:r>
-        <w:t xml:space="preserve">“</w:t>
-      </w:r>
-      <w:r>
-        <w:t xml:space="preserve">recurrent</w:t>
-      </w:r>
-      <w:r>
-        <w:t xml:space="preserve">”</w:t>
-      </w:r>
-      <w:r>
-        <w:t xml:space="preserve"> </w:t>
-      </w:r>
-      <w:r>
-        <w:t xml:space="preserve">present in 98% and</w:t>
-      </w:r>
-      <w:r>
-        <w:t xml:space="preserve"> </w:t>
-      </w:r>
-      <w:r>
-        <w:t xml:space="preserve">carrying the severity words</w:t>
-      </w:r>
-      <w:r>
-        <w:t xml:space="preserve"> </w:t>
-      </w:r>
-      <w:r>
-        <w:t xml:space="preserve">“</w:t>
-      </w:r>
-      <w:r>
-        <w:t xml:space="preserve">moderate</w:t>
-      </w:r>
-      <w:r>
-        <w:t xml:space="preserve">”</w:t>
-      </w:r>
-      <w:r>
-        <w:t xml:space="preserve">,</w:t>
-      </w:r>
-      <w:r>
-        <w:t xml:space="preserve"> </w:t>
-      </w:r>
-      <w:r>
-        <w:t xml:space="preserve">“</w:t>
-      </w:r>
-      <w:r>
-        <w:t xml:space="preserve">mild</w:t>
-      </w:r>
-      <w:r>
-        <w:t xml:space="preserve">”</w:t>
-      </w:r>
-      <w:r>
-        <w:t xml:space="preserve"> </w:t>
-      </w:r>
-      <w:r>
-        <w:t xml:space="preserve">and</w:t>
-      </w:r>
-      <w:r>
-        <w:t xml:space="preserve"> </w:t>
-      </w:r>
-      <w:r>
-        <w:t xml:space="preserve">“</w:t>
-      </w:r>
-      <w:r>
-        <w:t xml:space="preserve">severe</w:t>
-      </w:r>
-      <w:r>
-        <w:t xml:space="preserve">”</w:t>
-      </w:r>
-      <w:r>
-        <w:t xml:space="preserve">) and a smaller</w:t>
-      </w:r>
-      <w:r>
-        <w:t xml:space="preserve"> </w:t>
-      </w:r>
-      <w:r>
-        <w:t xml:space="preserve">unspecified-recurrence subgroup (n = 3,013,</w:t>
-      </w:r>
-      <w:r>
-        <w:t xml:space="preserve"> </w:t>
-      </w:r>
-      <w:r>
-        <w:t xml:space="preserve">“</w:t>
-      </w:r>
-      <w:r>
-        <w:t xml:space="preserve">unspecified</w:t>
-      </w:r>
-      <w:r>
-        <w:t xml:space="preserve">”</w:t>
-      </w:r>
-      <w:r>
-        <w:t xml:space="preserve"> </w:t>
-      </w:r>
-      <w:r>
-        <w:t xml:space="preserve">in 100% and no</w:t>
-      </w:r>
-      <w:r>
-        <w:t xml:space="preserve"> </w:t>
-      </w:r>
-      <w:r>
-        <w:t xml:space="preserve">severity wording). That smaller</w:t>
-      </w:r>
-      <w:r>
-        <w:t xml:space="preserve"> </w:t>
-      </w:r>
-      <w:r>
-        <w:t xml:space="preserve">subgroup is the same ≈3,000 patients (7% of the cohort) that a flat</w:t>
-      </w:r>
-      <w:r>
-        <w:t xml:space="preserve"> </w:t>
-      </w:r>
-      <w:r>
-        <w:t xml:space="preserve">three-cluster solution peels off. Cluster B (single-episode)</w:t>
-      </w:r>
-      <w:r>
-        <w:t xml:space="preserve"> </w:t>
-      </w:r>
-      <w:r>
-        <w:t xml:space="preserve">does</w:t>
-      </w:r>
-      <w:r>
-        <w:t xml:space="preserve"> </w:t>
-      </w:r>
-      <w:r>
-        <w:rPr>
           <w:bCs/>
-          <w:b/>
         </w:rPr>
         <w:t xml:space="preserve">not</w:t>
       </w:r>
@@ -2530,220 +2350,192 @@
       </w:pPr>
       <w:r>
         <w:rPr>
+          <w:b/>
           <w:bCs/>
-          <w:b/>
-          <w:iCs/>
-          <w:i/>
+          <w:i/>
+          <w:iCs/>
         </w:rPr>
         <w:t xml:space="preserve">Table S5.</w:t>
       </w:r>
       <w:r>
         <w:rPr>
-          <w:iCs/>
-          <w:i/>
-        </w:rPr>
-        <w:t xml:space="preserve"> </w:t>
-      </w:r>
-      <w:r>
-        <w:rPr>
-          <w:iCs/>
-          <w:i/>
+          <w:i/>
+          <w:iCs/>
+        </w:rPr>
+        <w:t xml:space="preserve"> </w:t>
+      </w:r>
+      <w:r>
+        <w:rPr>
+          <w:i/>
+          <w:iCs/>
         </w:rPr>
         <w:t xml:space="preserve">Do the two clusters of Table S4 split again? Each parent</w:t>
       </w:r>
       <w:r>
         <w:rPr>
-          <w:iCs/>
-          <w:i/>
-        </w:rPr>
-        <w:t xml:space="preserve"> </w:t>
-      </w:r>
-      <w:r>
-        <w:rPr>
-          <w:iCs/>
-          <w:i/>
+          <w:i/>
+          <w:iCs/>
+        </w:rPr>
+        <w:t xml:space="preserve"> </w:t>
+      </w:r>
+      <w:r>
+        <w:rPr>
+          <w:i/>
+          <w:iCs/>
         </w:rPr>
         <w:t xml:space="preserve">cluster was re-clustered on its own with k-means (k = 2).</w:t>
       </w:r>
       <w:r>
         <w:rPr>
-          <w:iCs/>
-          <w:i/>
-        </w:rPr>
-        <w:t xml:space="preserve"> </w:t>
-      </w:r>
-      <w:r>
-        <w:rPr>
-          <w:iCs/>
-          <w:i/>
-        </w:rPr>
-        <w:t xml:space="preserve">“</w:t>
-      </w:r>
-      <w:r>
-        <w:rPr>
-          <w:iCs/>
-          <w:i/>
-        </w:rPr>
-        <w:t xml:space="preserve">Driving token</w:t>
-      </w:r>
-      <w:r>
-        <w:rPr>
-          <w:iCs/>
-          <w:i/>
-        </w:rPr>
-        <w:t xml:space="preserve">”</w:t>
-      </w:r>
-      <w:r>
-        <w:rPr>
-          <w:iCs/>
-          <w:i/>
-        </w:rPr>
-        <w:t xml:space="preserve"> </w:t>
-      </w:r>
-      <w:r>
-        <w:rPr>
-          <w:iCs/>
-          <w:i/>
+          <w:i/>
+          <w:iCs/>
+        </w:rPr>
+        <w:t xml:space="preserve"> </w:t>
+      </w:r>
+      <w:r>
+        <w:rPr>
+          <w:i/>
+          <w:iCs/>
+        </w:rPr>
+        <w:t xml:space="preserve">“Driving token”</w:t>
+      </w:r>
+      <w:r>
+        <w:rPr>
+          <w:i/>
+          <w:iCs/>
+        </w:rPr>
+        <w:t xml:space="preserve"> </w:t>
+      </w:r>
+      <w:r>
+        <w:rPr>
+          <w:i/>
+          <w:iCs/>
         </w:rPr>
         <w:t xml:space="preserve">is the word whose presence best separates the two resulting sub-clusters,</w:t>
       </w:r>
       <w:r>
         <w:rPr>
-          <w:iCs/>
-          <w:i/>
-        </w:rPr>
-        <w:t xml:space="preserve"> </w:t>
-      </w:r>
-      <w:r>
-        <w:rPr>
-          <w:iCs/>
-          <w:i/>
+          <w:i/>
+          <w:iCs/>
+        </w:rPr>
+        <w:t xml:space="preserve"> </w:t>
+      </w:r>
+      <w:r>
+        <w:rPr>
+          <w:i/>
+          <w:iCs/>
         </w:rPr>
         <w:t xml:space="preserve">and the two proportions are the fraction of narratives containing that</w:t>
       </w:r>
       <w:r>
         <w:rPr>
-          <w:iCs/>
-          <w:i/>
-        </w:rPr>
-        <w:t xml:space="preserve"> </w:t>
-      </w:r>
-      <w:r>
-        <w:rPr>
-          <w:iCs/>
-          <w:i/>
+          <w:i/>
+          <w:iCs/>
+        </w:rPr>
+        <w:t xml:space="preserve"> </w:t>
+      </w:r>
+      <w:r>
+        <w:rPr>
+          <w:i/>
+          <w:iCs/>
         </w:rPr>
         <w:t xml:space="preserve">word in each sub-cluster, so 0.98 / 0.00 means the word is essentially present</w:t>
       </w:r>
       <w:r>
         <w:rPr>
-          <w:iCs/>
-          <w:i/>
-        </w:rPr>
-        <w:t xml:space="preserve"> </w:t>
-      </w:r>
-      <w:r>
-        <w:rPr>
-          <w:iCs/>
-          <w:i/>
+          <w:i/>
+          <w:iCs/>
+        </w:rPr>
+        <w:t xml:space="preserve"> </w:t>
+      </w:r>
+      <w:r>
+        <w:rPr>
+          <w:i/>
+          <w:iCs/>
         </w:rPr>
         <w:t xml:space="preserve">in one sub-cluster and absent from the other.</w:t>
       </w:r>
       <w:r>
         <w:rPr>
-          <w:iCs/>
-          <w:i/>
-        </w:rPr>
-        <w:t xml:space="preserve"> </w:t>
-      </w:r>
-      <w:r>
-        <w:rPr>
-          <w:iCs/>
-          <w:i/>
-        </w:rPr>
-        <w:t xml:space="preserve">“</w:t>
-      </w:r>
-      <w:r>
-        <w:rPr>
-          <w:iCs/>
-          <w:i/>
-        </w:rPr>
-        <w:t xml:space="preserve">Split silhouette</w:t>
-      </w:r>
-      <w:r>
-        <w:rPr>
-          <w:iCs/>
-          <w:i/>
-        </w:rPr>
-        <w:t xml:space="preserve">”</w:t>
-      </w:r>
-      <w:r>
-        <w:rPr>
-          <w:iCs/>
-          <w:i/>
-        </w:rPr>
-        <w:t xml:space="preserve"> </w:t>
-      </w:r>
-      <w:r>
-        <w:rPr>
-          <w:iCs/>
-          <w:i/>
+          <w:i/>
+          <w:iCs/>
+        </w:rPr>
+        <w:t xml:space="preserve"> </w:t>
+      </w:r>
+      <w:r>
+        <w:rPr>
+          <w:i/>
+          <w:iCs/>
+        </w:rPr>
+        <w:t xml:space="preserve">“Split silhouette”</w:t>
+      </w:r>
+      <w:r>
+        <w:rPr>
+          <w:i/>
+          <w:iCs/>
+        </w:rPr>
+        <w:t xml:space="preserve"> </w:t>
+      </w:r>
+      <w:r>
+        <w:rPr>
+          <w:i/>
+          <w:iCs/>
         </w:rPr>
         <w:t xml:space="preserve">scores how cleanly the two sub-clusters separate. Compare it against</w:t>
       </w:r>
       <w:r>
         <w:rPr>
-          <w:iCs/>
-          <w:i/>
-        </w:rPr>
-        <w:t xml:space="preserve"> </w:t>
-      </w:r>
-      <w:r>
-        <w:rPr>
-          <w:iCs/>
-          <w:i/>
+          <w:i/>
+          <w:iCs/>
+        </w:rPr>
+        <w:t xml:space="preserve"> </w:t>
+      </w:r>
+      <w:r>
+        <w:rPr>
+          <w:i/>
+          <w:iCs/>
         </w:rPr>
         <w:t xml:space="preserve">0.48, the score of the top-level split under the same metric. Cluster A</w:t>
       </w:r>
       <w:r>
         <w:rPr>
-          <w:iCs/>
-          <w:i/>
-        </w:rPr>
-        <w:t xml:space="preserve"> </w:t>
-      </w:r>
-      <w:r>
-        <w:rPr>
-          <w:iCs/>
-          <w:i/>
+          <w:i/>
+          <w:iCs/>
+        </w:rPr>
+        <w:t xml:space="preserve"> </w:t>
+      </w:r>
+      <w:r>
+        <w:rPr>
+          <w:i/>
+          <w:iCs/>
         </w:rPr>
         <w:t xml:space="preserve">splits cleanly, on recurrence phrasing. Cluster B does not split: its</w:t>
       </w:r>
       <w:r>
         <w:rPr>
-          <w:iCs/>
-          <w:i/>
-        </w:rPr>
-        <w:t xml:space="preserve"> </w:t>
-      </w:r>
-      <w:r>
-        <w:rPr>
-          <w:iCs/>
-          <w:i/>
+          <w:i/>
+          <w:iCs/>
+        </w:rPr>
+        <w:t xml:space="preserve"> </w:t>
+      </w:r>
+      <w:r>
+        <w:rPr>
+          <w:i/>
+          <w:iCs/>
         </w:rPr>
         <w:t xml:space="preserve">0.21 is a weak data-completeness gradient on the missing-data sentinel,</w:t>
       </w:r>
       <w:r>
         <w:rPr>
-          <w:iCs/>
-          <w:i/>
-        </w:rPr>
-        <w:t xml:space="preserve"> </w:t>
-      </w:r>
-      <w:r>
-        <w:rPr>
-          <w:iCs/>
-          <w:i/>
+          <w:i/>
+          <w:iCs/>
+        </w:rPr>
+        <w:t xml:space="preserve"> </w:t>
+      </w:r>
+      <w:r>
+        <w:rPr>
+          <w:i/>
+          <w:iCs/>
         </w:rPr>
         <w:t xml:space="preserve">which is why it is not plotted in Figure S5.</w:t>
       </w:r>
@@ -2751,7 +2543,8 @@
     <w:tbl>
       <w:tblPr>
         <w:tblStyle w:val="Table"/>
-        <w:tblW w:type="pct" w:w="5000.0"/>
+        <w:tblW w:type="pct" w:w="5000"/>
+        <w:tblLayout w:type="fixed"/>
         <w:tblLook w:firstRow="1" w:lastRow="0" w:firstColumn="0" w:lastColumn="0" w:noHBand="0" w:noVBand="0" w:val="0020"/>
       </w:tblPr>
       <w:tblGrid>
@@ -2763,11 +2556,14 @@
         <w:gridCol w:w="1800"/>
       </w:tblGrid>
       <w:tr>
+        <w:trPr>
+          <w:tblHeader w:val="on"/>
+        </w:trPr>
         <w:tc>
+          <w:tcPr/>
           <w:p>
             <w:pPr>
               <w:pStyle w:val="Compact"/>
-              <w:jc w:val="left"/>
             </w:pPr>
             <w:r>
               <w:t xml:space="preserve">Parent cluster (n)</w:t>
@@ -2775,10 +2571,10 @@
           </w:p>
         </w:tc>
         <w:tc>
+          <w:tcPr/>
           <w:p>
             <w:pPr>
               <w:pStyle w:val="Compact"/>
-              <w:jc w:val="left"/>
             </w:pPr>
             <w:r>
               <w:t xml:space="preserve">Splits into (n / n)</w:t>
@@ -2786,10 +2582,10 @@
           </w:p>
         </w:tc>
         <w:tc>
+          <w:tcPr/>
           <w:p>
             <w:pPr>
               <w:pStyle w:val="Compact"/>
-              <w:jc w:val="left"/>
             </w:pPr>
             <w:r>
               <w:t xml:space="preserve">Driving token</w:t>
@@ -2797,6 +2593,7 @@
           </w:p>
         </w:tc>
         <w:tc>
+          <w:tcPr/>
           <w:p>
             <w:pPr>
               <w:pStyle w:val="Compact"/>
@@ -2808,6 +2605,7 @@
           </w:p>
         </w:tc>
         <w:tc>
+          <w:tcPr/>
           <w:p>
             <w:pPr>
               <w:pStyle w:val="Compact"/>
@@ -2819,6 +2617,7 @@
           </w:p>
         </w:tc>
         <w:tc>
+          <w:tcPr/>
           <w:p>
             <w:pPr>
               <w:pStyle w:val="Compact"/>
@@ -2832,10 +2631,10 @@
       </w:tr>
       <w:tr>
         <w:tc>
+          <w:tcPr/>
           <w:p>
             <w:pPr>
               <w:pStyle w:val="Compact"/>
-              <w:jc w:val="left"/>
             </w:pPr>
             <w:r>
               <w:t xml:space="preserve">A: no</w:t>
@@ -2844,13 +2643,7 @@
               <w:t xml:space="preserve"> </w:t>
             </w:r>
             <w:r>
-              <w:t xml:space="preserve">“</w:t>
-            </w:r>
-            <w:r>
-              <w:t xml:space="preserve">episode</w:t>
-            </w:r>
-            <w:r>
-              <w:t xml:space="preserve">”</w:t>
+              <w:t xml:space="preserve">“episode”</w:t>
             </w:r>
             <w:r>
               <w:t xml:space="preserve"> </w:t>
@@ -2861,10 +2654,10 @@
           </w:p>
         </w:tc>
         <w:tc>
+          <w:tcPr/>
           <w:p>
             <w:pPr>
               <w:pStyle w:val="Compact"/>
-              <w:jc w:val="left"/>
             </w:pPr>
             <w:r>
               <w:t xml:space="preserve">recurrent + severity (11,425) / unspecified (3,013)</w:t>
@@ -2872,10 +2665,10 @@
           </w:p>
         </w:tc>
         <w:tc>
+          <w:tcPr/>
           <w:p>
             <w:pPr>
               <w:pStyle w:val="Compact"/>
-              <w:jc w:val="left"/>
             </w:pPr>
             <w:r>
               <w:t xml:space="preserve">recurrent</w:t>
@@ -2883,6 +2676,7 @@
           </w:p>
         </w:tc>
         <w:tc>
+          <w:tcPr/>
           <w:p>
             <w:pPr>
               <w:pStyle w:val="Compact"/>
@@ -2894,6 +2688,7 @@
           </w:p>
         </w:tc>
         <w:tc>
+          <w:tcPr/>
           <w:p>
             <w:pPr>
               <w:pStyle w:val="Compact"/>
@@ -2905,6 +2700,7 @@
           </w:p>
         </w:tc>
         <w:tc>
+          <w:tcPr/>
           <w:p>
             <w:pPr>
               <w:pStyle w:val="Compact"/>
@@ -2918,10 +2714,10 @@
       </w:tr>
       <w:tr>
         <w:tc>
+          <w:tcPr/>
           <w:p>
             <w:pPr>
               <w:pStyle w:val="Compact"/>
-              <w:jc w:val="left"/>
             </w:pPr>
             <w:r>
               <w:t xml:space="preserve">B: single-episode (28,141)</w:t>
@@ -2929,10 +2725,10 @@
           </w:p>
         </w:tc>
         <w:tc>
+          <w:tcPr/>
           <w:p>
             <w:pPr>
               <w:pStyle w:val="Compact"/>
-              <w:jc w:val="left"/>
             </w:pPr>
             <w:r>
               <w:t xml:space="preserve">sparse record (6,594) / populated record (21,547)</w:t>
@@ -2940,10 +2736,10 @@
           </w:p>
         </w:tc>
         <w:tc>
+          <w:tcPr/>
           <w:p>
             <w:pPr>
               <w:pStyle w:val="Compact"/>
-              <w:jc w:val="left"/>
             </w:pPr>
             <w:r>
               <w:t xml:space="preserve">missing</w:t>
@@ -2951,6 +2747,7 @@
           </w:p>
         </w:tc>
         <w:tc>
+          <w:tcPr/>
           <w:p>
             <w:pPr>
               <w:pStyle w:val="Compact"/>
@@ -2962,6 +2759,7 @@
           </w:p>
         </w:tc>
         <w:tc>
+          <w:tcPr/>
           <w:p>
             <w:pPr>
               <w:pStyle w:val="Compact"/>
@@ -2973,6 +2771,7 @@
           </w:p>
         </w:tc>
         <w:tc>
+          <w:tcPr/>
           <w:p>
             <w:pPr>
               <w:pStyle w:val="Compact"/>
@@ -3071,7 +2870,7 @@
         <w:t xml:space="preserve">primary analyses use Qwen3-Embedding-8B.</w:t>
       </w:r>
     </w:p>
-    <w:bookmarkEnd w:id="26"/>
+    <w:bookmarkEnd w:id="38"/>
     <w:sectPr>
       <w:pgSz w:h="15840" w:w="12240"/>
       <w:pgMar w:bottom="1440" w:footer="708" w:gutter="0" w:header="708" w:left="1800" w:right="1800" w:top="1440"/>
@@ -3283,14 +3082,14 @@
     </w:lvl>
   </w:abstractNum>
   <w:abstractNum w:abstractNumId="990">
-    <w:nsid w:val="2c1ae401"/>
+    <w:nsid w:val="0000A990"/>
     <w:multiLevelType w:val="multilevel"/>
     <w:lvl w:ilvl="0">
       <w:numFmt w:val="bullet"/>
       <w:lvlText w:val=" "/>
       <w:lvlJc w:val="left"/>
       <w:pPr>
-        <w:ind w:left="720" w:hanging="480"/>
+        <w:ind w:left="720" w:hanging="360"/>
       </w:pPr>
     </w:lvl>
     <w:lvl w:ilvl="1">
@@ -3298,7 +3097,7 @@
       <w:lvlText w:val=" "/>
       <w:lvlJc w:val="left"/>
       <w:pPr>
-        <w:ind w:left="1440" w:hanging="480"/>
+        <w:ind w:left="1440" w:hanging="360"/>
       </w:pPr>
     </w:lvl>
     <w:lvl w:ilvl="2">
@@ -3306,7 +3105,7 @@
       <w:lvlText w:val=" "/>
       <w:lvlJc w:val="left"/>
       <w:pPr>
-        <w:ind w:left="2160" w:hanging="480"/>
+        <w:ind w:left="2160" w:hanging="360"/>
       </w:pPr>
     </w:lvl>
     <w:lvl w:ilvl="3">
@@ -3314,7 +3113,7 @@
       <w:lvlText w:val=" "/>
       <w:lvlJc w:val="left"/>
       <w:pPr>
-        <w:ind w:left="2880" w:hanging="480"/>
+        <w:ind w:left="2880" w:hanging="360"/>
       </w:pPr>
     </w:lvl>
     <w:lvl w:ilvl="4">
@@ -3322,7 +3121,7 @@
       <w:lvlText w:val=" "/>
       <w:lvlJc w:val="left"/>
       <w:pPr>
-        <w:ind w:left="3600" w:hanging="480"/>
+        <w:ind w:left="3600" w:hanging="360"/>
       </w:pPr>
     </w:lvl>
     <w:lvl w:ilvl="5">
@@ -3330,7 +3129,7 @@
       <w:lvlText w:val=" "/>
       <w:lvlJc w:val="left"/>
       <w:pPr>
-        <w:ind w:left="4320" w:hanging="480"/>
+        <w:ind w:left="4320" w:hanging="360"/>
       </w:pPr>
     </w:lvl>
     <w:lvl w:ilvl="6">
@@ -3338,7 +3137,7 @@
       <w:lvlText w:val=" "/>
       <w:lvlJc w:val="left"/>
       <w:pPr>
-        <w:ind w:left="5040" w:hanging="480"/>
+        <w:ind w:left="5040" w:hanging="360"/>
       </w:pPr>
     </w:lvl>
     <w:lvl w:ilvl="7">
@@ -3346,7 +3145,7 @@
       <w:lvlText w:val=" "/>
       <w:lvlJc w:val="left"/>
       <w:pPr>
-        <w:ind w:left="5760" w:hanging="480"/>
+        <w:ind w:left="5760" w:hanging="360"/>
       </w:pPr>
     </w:lvl>
     <w:lvl w:ilvl="8">
@@ -3354,84 +3153,111 @@
       <w:lvlText w:val=" "/>
       <w:lvlJc w:val="left"/>
       <w:pPr>
-        <w:ind w:left="6480" w:hanging="480"/>
+        <w:ind w:left="6480" w:hanging="360"/>
       </w:pPr>
     </w:lvl>
   </w:abstractNum>
   <w:abstractNum w:abstractNumId="991">
-    <w:nsid w:val="ea454b4c"/>
+    <w:nsid w:val="0000A991"/>
     <w:multiLevelType w:val="multilevel"/>
     <w:lvl w:ilvl="0">
       <w:numFmt w:val="bullet"/>
-      <w:lvlText w:val="•"/>
+      <w:lvlText w:val=""/>
       <w:lvlJc w:val="left"/>
       <w:pPr>
-        <w:ind w:left="720" w:hanging="480"/>
-      </w:pPr>
+        <w:ind w:left="720" w:hanging="360"/>
+      </w:pPr>
+      <w:rPr>
+        <w:rFonts w:ascii="Symbol" w:hAnsi="Symbol" w:cs="Symbol" w:hint="default"/>
+      </w:rPr>
     </w:lvl>
     <w:lvl w:ilvl="1">
       <w:numFmt w:val="bullet"/>
-      <w:lvlText w:val="–"/>
+      <w:lvlText w:val="o"/>
       <w:lvlJc w:val="left"/>
       <w:pPr>
-        <w:ind w:left="1440" w:hanging="480"/>
-      </w:pPr>
+        <w:ind w:left="1440" w:hanging="360"/>
+      </w:pPr>
+      <w:rPr>
+        <w:rFonts w:ascii="Courier New" w:hAnsi="Courier New" w:cs="Courier New" w:hint="default"/>
+      </w:rPr>
     </w:lvl>
     <w:lvl w:ilvl="2">
       <w:numFmt w:val="bullet"/>
-      <w:lvlText w:val="•"/>
+      <w:lvlText w:val=""/>
       <w:lvlJc w:val="left"/>
       <w:pPr>
-        <w:ind w:left="2160" w:hanging="480"/>
-      </w:pPr>
+        <w:ind w:left="2160" w:hanging="360"/>
+      </w:pPr>
+      <w:rPr>
+        <w:rFonts w:ascii="Wingdings" w:hAnsi="Wingdings" w:cs="Wingdings" w:hint="default"/>
+      </w:rPr>
     </w:lvl>
     <w:lvl w:ilvl="3">
       <w:numFmt w:val="bullet"/>
-      <w:lvlText w:val="–"/>
+      <w:lvlText w:val=""/>
       <w:lvlJc w:val="left"/>
       <w:pPr>
-        <w:ind w:left="2880" w:hanging="480"/>
-      </w:pPr>
+        <w:ind w:left="2880" w:hanging="360"/>
+      </w:pPr>
+      <w:rPr>
+        <w:rFonts w:ascii="Symbol" w:hAnsi="Symbol" w:cs="Symbol" w:hint="default"/>
+      </w:rPr>
     </w:lvl>
     <w:lvl w:ilvl="4">
       <w:numFmt w:val="bullet"/>
-      <w:lvlText w:val="•"/>
+      <w:lvlText w:val="o"/>
       <w:lvlJc w:val="left"/>
       <w:pPr>
-        <w:ind w:left="3600" w:hanging="480"/>
-      </w:pPr>
+        <w:ind w:left="3600" w:hanging="360"/>
+      </w:pPr>
+      <w:rPr>
+        <w:rFonts w:ascii="Courier New" w:hAnsi="Courier New" w:cs="Courier New" w:hint="default"/>
+      </w:rPr>
     </w:lvl>
     <w:lvl w:ilvl="5">
       <w:numFmt w:val="bullet"/>
-      <w:lvlText w:val="–"/>
+      <w:lvlText w:val=""/>
       <w:lvlJc w:val="left"/>
       <w:pPr>
-        <w:ind w:left="4320" w:hanging="480"/>
-      </w:pPr>
+        <w:ind w:left="4320" w:hanging="360"/>
+      </w:pPr>
+      <w:rPr>
+        <w:rFonts w:ascii="Wingdings" w:hAnsi="Wingdings" w:cs="Wingdings" w:hint="default"/>
+      </w:rPr>
     </w:lvl>
     <w:lvl w:ilvl="6">
       <w:numFmt w:val="bullet"/>
-      <w:lvlText w:val="•"/>
+      <w:lvlText w:val=""/>
       <w:lvlJc w:val="left"/>
       <w:pPr>
-        <w:ind w:left="5040" w:hanging="480"/>
-      </w:pPr>
+        <w:ind w:left="5040" w:hanging="360"/>
+      </w:pPr>
+      <w:rPr>
+        <w:rFonts w:ascii="Symbol" w:hAnsi="Symbol" w:cs="Symbol" w:hint="default"/>
+      </w:rPr>
     </w:lvl>
     <w:lvl w:ilvl="7">
       <w:numFmt w:val="bullet"/>
-      <w:lvlText w:val="–"/>
+      <w:lvlText w:val="o"/>
       <w:lvlJc w:val="left"/>
       <w:pPr>
-        <w:ind w:left="5760" w:hanging="480"/>
-      </w:pPr>
+        <w:ind w:left="5760" w:hanging="360"/>
+      </w:pPr>
+      <w:rPr>
+        <w:rFonts w:ascii="Courier New" w:hAnsi="Courier New" w:cs="Courier New" w:hint="default"/>
+      </w:rPr>
     </w:lvl>
     <w:lvl w:ilvl="8">
       <w:numFmt w:val="bullet"/>
-      <w:lvlText w:val="•"/>
+      <w:lvlText w:val=""/>
       <w:lvlJc w:val="left"/>
       <w:pPr>
-        <w:ind w:left="6480" w:hanging="480"/>
-      </w:pPr>
+        <w:ind w:left="6480" w:hanging="360"/>
+      </w:pPr>
+      <w:rPr>
+        <w:rFonts w:ascii="Wingdings" w:hAnsi="Wingdings" w:cs="Wingdings" w:hint="default"/>
+      </w:rPr>
     </w:lvl>
   </w:abstractNum>
   <w:num w16cid:durableId="1305820082" w:numId="1">
@@ -4184,8 +4010,8 @@
     <w:name w:val="KeywordTok"/>
     <w:basedOn w:val="VerbatimChar"/>
     <w:rPr>
+      <w:b/>
       <w:color w:val="007020"/>
-      <w:b/>
     </w:rPr>
   </w:style>
   <w:style w:type="character" w:customStyle="1" w:styleId="DataTypeTok">
@@ -4261,40 +4087,43 @@
   <w:style w:type="character" w:customStyle="1" w:styleId="ImportTok">
     <w:name w:val="ImportTok"/>
     <w:basedOn w:val="VerbatimChar"/>
-    <w:rPr/>
+    <w:rPr>
+      <w:b/>
+      <w:color w:val="008000"/>
+    </w:rPr>
   </w:style>
   <w:style w:type="character" w:customStyle="1" w:styleId="CommentTok">
     <w:name w:val="CommentTok"/>
     <w:basedOn w:val="VerbatimChar"/>
     <w:rPr>
+      <w:i/>
       <w:color w:val="60a0b0"/>
-      <w:i/>
     </w:rPr>
   </w:style>
   <w:style w:type="character" w:customStyle="1" w:styleId="DocumentationTok">
     <w:name w:val="DocumentationTok"/>
     <w:basedOn w:val="VerbatimChar"/>
     <w:rPr>
+      <w:i/>
       <w:color w:val="ba2121"/>
-      <w:i/>
     </w:rPr>
   </w:style>
   <w:style w:type="character" w:customStyle="1" w:styleId="AnnotationTok">
     <w:name w:val="AnnotationTok"/>
     <w:basedOn w:val="VerbatimChar"/>
     <w:rPr>
-      <w:color w:val="60a0b0"/>
       <w:b/>
       <w:i/>
+      <w:color w:val="60a0b0"/>
     </w:rPr>
   </w:style>
   <w:style w:type="character" w:customStyle="1" w:styleId="CommentVarTok">
     <w:name w:val="CommentVarTok"/>
     <w:basedOn w:val="VerbatimChar"/>
     <w:rPr>
-      <w:color w:val="60a0b0"/>
       <w:b/>
       <w:i/>
+      <w:color w:val="60a0b0"/>
     </w:rPr>
   </w:style>
   <w:style w:type="character" w:customStyle="1" w:styleId="OtherTok">
@@ -4322,8 +4151,8 @@
     <w:name w:val="ControlFlowTok"/>
     <w:basedOn w:val="VerbatimChar"/>
     <w:rPr>
+      <w:b/>
       <w:color w:val="007020"/>
-      <w:b/>
     </w:rPr>
   </w:style>
   <w:style w:type="character" w:customStyle="1" w:styleId="OperatorTok">
@@ -4336,7 +4165,9 @@
   <w:style w:type="character" w:customStyle="1" w:styleId="BuiltInTok">
     <w:name w:val="BuiltInTok"/>
     <w:basedOn w:val="VerbatimChar"/>
-    <w:rPr/>
+    <w:rPr>
+      <w:color w:val="008000"/>
+    </w:rPr>
   </w:style>
   <w:style w:type="character" w:customStyle="1" w:styleId="ExtensionTok">
     <w:name w:val="ExtensionTok"/>
@@ -4366,34 +4197,34 @@
     <w:name w:val="InformationTok"/>
     <w:basedOn w:val="VerbatimChar"/>
     <w:rPr>
-      <w:color w:val="60a0b0"/>
       <w:b/>
       <w:i/>
+      <w:color w:val="60a0b0"/>
     </w:rPr>
   </w:style>
   <w:style w:type="character" w:customStyle="1" w:styleId="WarningTok">
     <w:name w:val="WarningTok"/>
     <w:basedOn w:val="VerbatimChar"/>
     <w:rPr>
-      <w:color w:val="60a0b0"/>
       <w:b/>
       <w:i/>
+      <w:color w:val="60a0b0"/>
     </w:rPr>
   </w:style>
   <w:style w:type="character" w:customStyle="1" w:styleId="AlertTok">
     <w:name w:val="AlertTok"/>
     <w:basedOn w:val="VerbatimChar"/>
     <w:rPr>
+      <w:b/>
       <w:color w:val="ff0000"/>
-      <w:b/>
     </w:rPr>
   </w:style>
   <w:style w:type="character" w:customStyle="1" w:styleId="ErrorTok">
     <w:name w:val="ErrorTok"/>
     <w:basedOn w:val="VerbatimChar"/>
     <w:rPr>
+      <w:b/>
       <w:color w:val="ff0000"/>
-      <w:b/>
     </w:rPr>
   </w:style>
   <w:style w:type="character" w:customStyle="1" w:styleId="NormalTok">

</xml_diff>